<commit_message>
Add CLI assistant with RAG routing, quality validation, and test runner.
Introduces assistant_cli, prompt-driven routing, retrieval reranking, programmatic quality checks, test logs, prompts/stek docs, and an expanded README.

Co-authored-by: Cursor <cursoragent@cursor.com>
</commit_message>
<xml_diff>
--- a/Техническое задание.docx
+++ b/Техническое задание.docx
@@ -114,15 +114,7 @@
                 <w:iCs/>
                 <w:color w:val="0D0D0D" w:themeColor="text1" w:themeTint="F2"/>
               </w:rPr>
-              <w:t>AI-ассистент для медицинской клиники</w:t>
-            </w:r>
-            <w:r>
-              <w:rPr>
-                <w:i/>
-                <w:iCs/>
-                <w:color w:val="0D0D0D" w:themeColor="text1" w:themeTint="F2"/>
-              </w:rPr>
-              <w:t xml:space="preserve"> «</w:t>
+              <w:t>AI-ассистент для медицинской клиники «</w:t>
             </w:r>
             <w:r>
               <w:rPr>
@@ -244,39 +236,7 @@
                 <w:iCs/>
                 <w:color w:val="0D0D0D" w:themeColor="text1" w:themeTint="F2"/>
               </w:rPr>
-              <w:t>19</w:t>
-            </w:r>
-            <w:r>
-              <w:rPr>
-                <w:i/>
-                <w:iCs/>
-                <w:color w:val="0D0D0D" w:themeColor="text1" w:themeTint="F2"/>
-              </w:rPr>
-              <w:t>.</w:t>
-            </w:r>
-            <w:r>
-              <w:rPr>
-                <w:i/>
-                <w:iCs/>
-                <w:color w:val="0D0D0D" w:themeColor="text1" w:themeTint="F2"/>
-              </w:rPr>
-              <w:t>05</w:t>
-            </w:r>
-            <w:r>
-              <w:rPr>
-                <w:i/>
-                <w:iCs/>
-                <w:color w:val="0D0D0D" w:themeColor="text1" w:themeTint="F2"/>
-              </w:rPr>
-              <w:t>.</w:t>
-            </w:r>
-            <w:r>
-              <w:rPr>
-                <w:i/>
-                <w:iCs/>
-                <w:color w:val="0D0D0D" w:themeColor="text1" w:themeTint="F2"/>
-              </w:rPr>
-              <w:t>2026</w:t>
+              <w:t>19.05.2026</w:t>
             </w:r>
           </w:p>
         </w:tc>
@@ -462,13 +422,23 @@
                 <w:color w:val="0D0D0D" w:themeColor="text1" w:themeTint="F2"/>
               </w:rPr>
             </w:pPr>
-            <w:r>
-              <w:rPr>
-                <w:i/>
-                <w:iCs/>
-                <w:color w:val="0D0D0D" w:themeColor="text1" w:themeTint="F2"/>
-              </w:rPr>
-              <w:t>Петлин Дмитрий Витальевич</w:t>
+            <w:proofErr w:type="spellStart"/>
+            <w:r>
+              <w:rPr>
+                <w:i/>
+                <w:iCs/>
+                <w:color w:val="0D0D0D" w:themeColor="text1" w:themeTint="F2"/>
+              </w:rPr>
+              <w:t>Петлин</w:t>
+            </w:r>
+            <w:proofErr w:type="spellEnd"/>
+            <w:r>
+              <w:rPr>
+                <w:i/>
+                <w:iCs/>
+                <w:color w:val="0D0D0D" w:themeColor="text1" w:themeTint="F2"/>
+              </w:rPr>
+              <w:t xml:space="preserve"> Дмитрий Витальевич</w:t>
             </w:r>
           </w:p>
         </w:tc>
@@ -903,23 +873,7 @@
                 <w:iCs/>
                 <w:color w:val="0D0D0D" w:themeColor="text1" w:themeTint="F2"/>
               </w:rPr>
-              <w:t>Администраторы клиники (1 (один) сменный администратор</w:t>
-            </w:r>
-            <w:r>
-              <w:rPr>
-                <w:i/>
-                <w:iCs/>
-                <w:color w:val="0D0D0D" w:themeColor="text1" w:themeTint="F2"/>
-              </w:rPr>
-              <w:t xml:space="preserve"> в офисе, 20 офисов</w:t>
-            </w:r>
-            <w:r>
-              <w:rPr>
-                <w:i/>
-                <w:iCs/>
-                <w:color w:val="0D0D0D" w:themeColor="text1" w:themeTint="F2"/>
-              </w:rPr>
-              <w:t xml:space="preserve"> ежедневно обрабатывают большое (один звонок в 5 минут, ~150 запросов за 12 часов смены) количество повторяющихся вопросов от пациентов. Значительная часть обращений связана с режимом работы, записью на приём, подготовкой к анализам, получением результатов и правилами посещения. Ответы на эти вопросы содержатся в базе знаний, но пациентам неудобно искать их самостоятельно. Необходимо создать AI-ассистента, который будет отвечать на организационные вопросы и передавать сложные или медицинские обращения администратору или врачу.</w:t>
+              <w:t>Администраторы клиники (1 (один) сменный администратор в офисе, 20 офисов ежедневно обрабатывают большое (один звонок в 5 минут, ~150 запросов за 12 часов смены) количество повторяющихся вопросов от пациентов. Значительная часть обращений связана с режимом работы, записью на приём, подготовкой к анализам, получением результатов и правилами посещения. Ответы на эти вопросы содержатся в базе знаний, но пациентам неудобно искать их самостоятельно. Необходимо создать AI-ассистента, который будет отвечать на организационные вопросы и передавать сложные или медицинские обращения администратору или врачу.</w:t>
             </w:r>
           </w:p>
         </w:tc>
@@ -1790,7 +1744,47 @@
           <w:sz w:val="24"/>
           <w:szCs w:val="24"/>
         </w:rPr>
-        <w:t>3.2 Пользовательские сценарии (Use Cases)</w:t>
+        <w:t>3.2 Пользовательские сценарии (</w:t>
+      </w:r>
+      <w:proofErr w:type="spellStart"/>
+      <w:r>
+        <w:rPr>
+          <w:b/>
+          <w:bCs/>
+          <w:sz w:val="24"/>
+          <w:szCs w:val="24"/>
+        </w:rPr>
+        <w:t>Use</w:t>
+      </w:r>
+      <w:proofErr w:type="spellEnd"/>
+      <w:r>
+        <w:rPr>
+          <w:b/>
+          <w:bCs/>
+          <w:sz w:val="24"/>
+          <w:szCs w:val="24"/>
+        </w:rPr>
+        <w:t xml:space="preserve"> </w:t>
+      </w:r>
+      <w:proofErr w:type="spellStart"/>
+      <w:r>
+        <w:rPr>
+          <w:b/>
+          <w:bCs/>
+          <w:sz w:val="24"/>
+          <w:szCs w:val="24"/>
+        </w:rPr>
+        <w:t>Cases</w:t>
+      </w:r>
+      <w:proofErr w:type="spellEnd"/>
+      <w:r>
+        <w:rPr>
+          <w:b/>
+          <w:bCs/>
+          <w:sz w:val="24"/>
+          <w:szCs w:val="24"/>
+        </w:rPr>
+        <w:t>)</w:t>
       </w:r>
     </w:p>
     <w:p>
@@ -2021,7 +2015,21 @@
                 <w:color w:val="0D0D0D" w:themeColor="text1" w:themeTint="F2"/>
               </w:rPr>
               <w:br/>
-              <w:t>Ожидаемый результат: Ассистент сообщает доступные способы записи: телефон, сайт, Telegram-бот, онлайн-чат или обращение к администратору. Если реализована интеграция с системой записи, ассистент может предложить перейти к записи.</w:t>
+              <w:t xml:space="preserve">Ожидаемый результат: Ассистент сообщает доступные способы записи: телефон, сайт, </w:t>
+            </w:r>
+            <w:proofErr w:type="spellStart"/>
+            <w:r>
+              <w:rPr>
+                <w:color w:val="0D0D0D" w:themeColor="text1" w:themeTint="F2"/>
+              </w:rPr>
+              <w:t>Telegram</w:t>
+            </w:r>
+            <w:proofErr w:type="spellEnd"/>
+            <w:r>
+              <w:rPr>
+                <w:color w:val="0D0D0D" w:themeColor="text1" w:themeTint="F2"/>
+              </w:rPr>
+              <w:t>-бот, онлайн-чат или обращение к администратору. Если реализована интеграция с системой записи, ассистент может предложить перейти к записи.</w:t>
             </w:r>
           </w:p>
           <w:p>
@@ -2287,7 +2295,35 @@
                 <w:sz w:val="20"/>
                 <w:szCs w:val="20"/>
               </w:rPr>
-              <w:t>Название: Запрос остатка отпуска. Пользователь: Сотрудник. Триггер: «Сколько дней отпуска у меня осталось?»Результат: Ассистент показывает остаток дней и ссылку на заявку</w:t>
+              <w:t xml:space="preserve">Название: Запрос остатка отпуска. Пользователь: Сотрудник. Триггер: «Сколько дней отпуска у меня </w:t>
+            </w:r>
+            <w:proofErr w:type="spellStart"/>
+            <w:r>
+              <w:rPr>
+                <w:color w:val="047857"/>
+                <w:sz w:val="20"/>
+                <w:szCs w:val="20"/>
+              </w:rPr>
+              <w:t>осталось</w:t>
+            </w:r>
+            <w:proofErr w:type="gramStart"/>
+            <w:r>
+              <w:rPr>
+                <w:color w:val="047857"/>
+                <w:sz w:val="20"/>
+                <w:szCs w:val="20"/>
+              </w:rPr>
+              <w:t>?»Результат</w:t>
+            </w:r>
+            <w:proofErr w:type="spellEnd"/>
+            <w:proofErr w:type="gramEnd"/>
+            <w:r>
+              <w:rPr>
+                <w:color w:val="047857"/>
+                <w:sz w:val="20"/>
+                <w:szCs w:val="20"/>
+              </w:rPr>
+              <w:t>: Ассистент показывает остаток дней и ссылку на заявку</w:t>
             </w:r>
           </w:p>
         </w:tc>
@@ -2313,7 +2349,47 @@
           <w:sz w:val="24"/>
           <w:szCs w:val="24"/>
         </w:rPr>
-        <w:t>4.1 Основные функции (Must Have)</w:t>
+        <w:t>4.1 Основные функции (</w:t>
+      </w:r>
+      <w:proofErr w:type="spellStart"/>
+      <w:r>
+        <w:rPr>
+          <w:b/>
+          <w:bCs/>
+          <w:sz w:val="24"/>
+          <w:szCs w:val="24"/>
+        </w:rPr>
+        <w:t>Must</w:t>
+      </w:r>
+      <w:proofErr w:type="spellEnd"/>
+      <w:r>
+        <w:rPr>
+          <w:b/>
+          <w:bCs/>
+          <w:sz w:val="24"/>
+          <w:szCs w:val="24"/>
+        </w:rPr>
+        <w:t xml:space="preserve"> </w:t>
+      </w:r>
+      <w:proofErr w:type="spellStart"/>
+      <w:r>
+        <w:rPr>
+          <w:b/>
+          <w:bCs/>
+          <w:sz w:val="24"/>
+          <w:szCs w:val="24"/>
+        </w:rPr>
+        <w:t>Have</w:t>
+      </w:r>
+      <w:proofErr w:type="spellEnd"/>
+      <w:r>
+        <w:rPr>
+          <w:b/>
+          <w:bCs/>
+          <w:sz w:val="24"/>
+          <w:szCs w:val="24"/>
+        </w:rPr>
+        <w:t>)</w:t>
       </w:r>
     </w:p>
     <w:p>
@@ -2619,7 +2695,25 @@
                 <w:color w:val="0D0D0D" w:themeColor="text1" w:themeTint="F2"/>
               </w:rPr>
               <w:br/>
-              <w:t>Ассистент должен быть доступен через Telegram-бота или веб-чат.</w:t>
+              <w:t xml:space="preserve">Ассистент должен быть доступен через </w:t>
+            </w:r>
+            <w:proofErr w:type="spellStart"/>
+            <w:r>
+              <w:rPr>
+                <w:i/>
+                <w:iCs/>
+                <w:color w:val="0D0D0D" w:themeColor="text1" w:themeTint="F2"/>
+              </w:rPr>
+              <w:t>Telegram</w:t>
+            </w:r>
+            <w:proofErr w:type="spellEnd"/>
+            <w:r>
+              <w:rPr>
+                <w:i/>
+                <w:iCs/>
+                <w:color w:val="0D0D0D" w:themeColor="text1" w:themeTint="F2"/>
+              </w:rPr>
+              <w:t>-бота или веб-чат.</w:t>
             </w:r>
             <w:r>
               <w:rPr>
@@ -2741,7 +2835,47 @@
           <w:sz w:val="24"/>
           <w:szCs w:val="24"/>
         </w:rPr>
-        <w:t>4.2 Желательные функции (Should Have)</w:t>
+        <w:t>4.2 Желательные функции (</w:t>
+      </w:r>
+      <w:proofErr w:type="spellStart"/>
+      <w:r>
+        <w:rPr>
+          <w:b/>
+          <w:bCs/>
+          <w:sz w:val="24"/>
+          <w:szCs w:val="24"/>
+        </w:rPr>
+        <w:t>Should</w:t>
+      </w:r>
+      <w:proofErr w:type="spellEnd"/>
+      <w:r>
+        <w:rPr>
+          <w:b/>
+          <w:bCs/>
+          <w:sz w:val="24"/>
+          <w:szCs w:val="24"/>
+        </w:rPr>
+        <w:t xml:space="preserve"> </w:t>
+      </w:r>
+      <w:proofErr w:type="spellStart"/>
+      <w:r>
+        <w:rPr>
+          <w:b/>
+          <w:bCs/>
+          <w:sz w:val="24"/>
+          <w:szCs w:val="24"/>
+        </w:rPr>
+        <w:t>Have</w:t>
+      </w:r>
+      <w:proofErr w:type="spellEnd"/>
+      <w:r>
+        <w:rPr>
+          <w:b/>
+          <w:bCs/>
+          <w:sz w:val="24"/>
+          <w:szCs w:val="24"/>
+        </w:rPr>
+        <w:t>)</w:t>
       </w:r>
     </w:p>
     <w:p>
@@ -3077,7 +3211,47 @@
           <w:sz w:val="24"/>
           <w:szCs w:val="24"/>
         </w:rPr>
-        <w:t>4.3 Возможные функции (Could Have)</w:t>
+        <w:t>4.3 Возможные функции (</w:t>
+      </w:r>
+      <w:proofErr w:type="spellStart"/>
+      <w:r>
+        <w:rPr>
+          <w:b/>
+          <w:bCs/>
+          <w:sz w:val="24"/>
+          <w:szCs w:val="24"/>
+        </w:rPr>
+        <w:t>Could</w:t>
+      </w:r>
+      <w:proofErr w:type="spellEnd"/>
+      <w:r>
+        <w:rPr>
+          <w:b/>
+          <w:bCs/>
+          <w:sz w:val="24"/>
+          <w:szCs w:val="24"/>
+        </w:rPr>
+        <w:t xml:space="preserve"> </w:t>
+      </w:r>
+      <w:proofErr w:type="spellStart"/>
+      <w:r>
+        <w:rPr>
+          <w:b/>
+          <w:bCs/>
+          <w:sz w:val="24"/>
+          <w:szCs w:val="24"/>
+        </w:rPr>
+        <w:t>Have</w:t>
+      </w:r>
+      <w:proofErr w:type="spellEnd"/>
+      <w:r>
+        <w:rPr>
+          <w:b/>
+          <w:bCs/>
+          <w:sz w:val="24"/>
+          <w:szCs w:val="24"/>
+        </w:rPr>
+        <w:t>)</w:t>
       </w:r>
     </w:p>
     <w:p>
@@ -3358,6 +3532,7 @@
                 <w:color w:val="0D0D0D" w:themeColor="text1" w:themeTint="F2"/>
               </w:rPr>
             </w:pPr>
+            <w:proofErr w:type="spellStart"/>
             <w:r>
               <w:rPr>
                 <w:b/>
@@ -3368,6 +3543,7 @@
               </w:rPr>
               <w:t>Мультиязычность</w:t>
             </w:r>
+            <w:proofErr w:type="spellEnd"/>
           </w:p>
           <w:p>
             <w:pPr>
@@ -3449,7 +3625,47 @@
           <w:sz w:val="24"/>
           <w:szCs w:val="24"/>
         </w:rPr>
-        <w:t>4.4 Исключения (Won't Have)</w:t>
+        <w:t>4.4 Исключения (</w:t>
+      </w:r>
+      <w:proofErr w:type="spellStart"/>
+      <w:r>
+        <w:rPr>
+          <w:b/>
+          <w:bCs/>
+          <w:sz w:val="24"/>
+          <w:szCs w:val="24"/>
+        </w:rPr>
+        <w:t>Won't</w:t>
+      </w:r>
+      <w:proofErr w:type="spellEnd"/>
+      <w:r>
+        <w:rPr>
+          <w:b/>
+          <w:bCs/>
+          <w:sz w:val="24"/>
+          <w:szCs w:val="24"/>
+        </w:rPr>
+        <w:t xml:space="preserve"> </w:t>
+      </w:r>
+      <w:proofErr w:type="spellStart"/>
+      <w:r>
+        <w:rPr>
+          <w:b/>
+          <w:bCs/>
+          <w:sz w:val="24"/>
+          <w:szCs w:val="24"/>
+        </w:rPr>
+        <w:t>Have</w:t>
+      </w:r>
+      <w:proofErr w:type="spellEnd"/>
+      <w:r>
+        <w:rPr>
+          <w:b/>
+          <w:bCs/>
+          <w:sz w:val="24"/>
+          <w:szCs w:val="24"/>
+        </w:rPr>
+        <w:t>)</w:t>
       </w:r>
     </w:p>
     <w:p>
@@ -3464,7 +3680,29 @@
           <w:sz w:val="18"/>
           <w:szCs w:val="18"/>
         </w:rPr>
-        <w:t>Что точно НЕ входит в scope проекта</w:t>
+        <w:t xml:space="preserve">Что точно НЕ входит в </w:t>
+      </w:r>
+      <w:proofErr w:type="spellStart"/>
+      <w:r>
+        <w:rPr>
+          <w:i/>
+          <w:iCs/>
+          <w:color w:val="666666"/>
+          <w:sz w:val="18"/>
+          <w:szCs w:val="18"/>
+        </w:rPr>
+        <w:t>scope</w:t>
+      </w:r>
+      <w:proofErr w:type="spellEnd"/>
+      <w:r>
+        <w:rPr>
+          <w:i/>
+          <w:iCs/>
+          <w:color w:val="666666"/>
+          <w:sz w:val="18"/>
+          <w:szCs w:val="18"/>
+        </w:rPr>
+        <w:t xml:space="preserve"> проекта</w:t>
       </w:r>
     </w:p>
     <w:tbl>
@@ -3924,8 +4162,13 @@
               </w:rPr>
             </w:pPr>
             <w:r>
-              <w:t>PDF / DOCX / TXT / Markdown</w:t>
-            </w:r>
+              <w:t xml:space="preserve">PDF / DOCX / TXT / </w:t>
+            </w:r>
+            <w:proofErr w:type="spellStart"/>
+            <w:r>
+              <w:t>Markdown</w:t>
+            </w:r>
+            <w:proofErr w:type="spellEnd"/>
           </w:p>
         </w:tc>
         <w:tc>
@@ -4137,8 +4380,13 @@
           </w:tcPr>
           <w:p>
             <w:r>
-              <w:t>TXT / CSV / Markdown</w:t>
-            </w:r>
+              <w:t xml:space="preserve">TXT / CSV / </w:t>
+            </w:r>
+            <w:proofErr w:type="spellStart"/>
+            <w:r>
+              <w:t>Markdown</w:t>
+            </w:r>
+            <w:proofErr w:type="spellEnd"/>
           </w:p>
         </w:tc>
         <w:tc>
@@ -4231,7 +4479,15 @@
           </w:tcPr>
           <w:p>
             <w:r>
-              <w:t>CSV / Google Sheets / TXT</w:t>
+              <w:t xml:space="preserve">CSV / Google </w:t>
+            </w:r>
+            <w:proofErr w:type="spellStart"/>
+            <w:r>
+              <w:t>Sheets</w:t>
+            </w:r>
+            <w:proofErr w:type="spellEnd"/>
+            <w:r>
+              <w:t xml:space="preserve"> / TXT</w:t>
             </w:r>
           </w:p>
         </w:tc>
@@ -4435,8 +4691,13 @@
           </w:tcPr>
           <w:p>
             <w:r>
-              <w:t>DOCX / TXT / Markdown</w:t>
-            </w:r>
+              <w:t xml:space="preserve">DOCX / TXT / </w:t>
+            </w:r>
+            <w:proofErr w:type="spellStart"/>
+            <w:r>
+              <w:t>Markdown</w:t>
+            </w:r>
+            <w:proofErr w:type="spellEnd"/>
           </w:p>
         </w:tc>
         <w:tc>
@@ -4966,29 +5227,23 @@
                 <w:color w:val="0D0D0D" w:themeColor="text1" w:themeTint="F2"/>
               </w:rPr>
             </w:pPr>
-            <w:r>
-              <w:rPr>
-                <w:i/>
-                <w:iCs/>
-                <w:color w:val="0D0D0D" w:themeColor="text1" w:themeTint="F2"/>
-              </w:rPr>
-              <w:t xml:space="preserve">Telegram-бот </w:t>
-            </w:r>
-            <w:r>
-              <w:rPr>
-                <w:i/>
-                <w:iCs/>
-                <w:color w:val="0D0D0D" w:themeColor="text1" w:themeTint="F2"/>
-              </w:rPr>
-              <w:t>и/</w:t>
-            </w:r>
-            <w:r>
-              <w:rPr>
-                <w:i/>
-                <w:iCs/>
-                <w:color w:val="0D0D0D" w:themeColor="text1" w:themeTint="F2"/>
-              </w:rPr>
-              <w:t>или веб-чат</w:t>
+            <w:proofErr w:type="spellStart"/>
+            <w:r>
+              <w:rPr>
+                <w:i/>
+                <w:iCs/>
+                <w:color w:val="0D0D0D" w:themeColor="text1" w:themeTint="F2"/>
+              </w:rPr>
+              <w:t>Telegram</w:t>
+            </w:r>
+            <w:proofErr w:type="spellEnd"/>
+            <w:r>
+              <w:rPr>
+                <w:i/>
+                <w:iCs/>
+                <w:color w:val="0D0D0D" w:themeColor="text1" w:themeTint="F2"/>
+              </w:rPr>
+              <w:t>-бот и/или веб-чат</w:t>
             </w:r>
           </w:p>
         </w:tc>
@@ -5144,15 +5399,51 @@
                 <w:i/>
                 <w:iCs/>
                 <w:color w:val="0D0D0D" w:themeColor="text1" w:themeTint="F2"/>
-              </w:rPr>
-            </w:pPr>
-            <w:r>
-              <w:rPr>
-                <w:i/>
-                <w:iCs/>
-                <w:color w:val="0D0D0D" w:themeColor="text1" w:themeTint="F2"/>
-              </w:rPr>
-              <w:t>RAG, то есть Retrieval-Augmented Generation</w:t>
+                <w:lang w:val="en-US"/>
+              </w:rPr>
+            </w:pPr>
+            <w:r>
+              <w:rPr>
+                <w:i/>
+                <w:iCs/>
+                <w:color w:val="0D0D0D" w:themeColor="text1" w:themeTint="F2"/>
+                <w:lang w:val="en-US"/>
+              </w:rPr>
+              <w:t xml:space="preserve">RAG, </w:t>
+            </w:r>
+            <w:r>
+              <w:rPr>
+                <w:i/>
+                <w:iCs/>
+                <w:color w:val="0D0D0D" w:themeColor="text1" w:themeTint="F2"/>
+              </w:rPr>
+              <w:t>то</w:t>
+            </w:r>
+            <w:r>
+              <w:rPr>
+                <w:i/>
+                <w:iCs/>
+                <w:color w:val="0D0D0D" w:themeColor="text1" w:themeTint="F2"/>
+                <w:lang w:val="en-US"/>
+              </w:rPr>
+              <w:t xml:space="preserve"> </w:t>
+            </w:r>
+            <w:r>
+              <w:rPr>
+                <w:i/>
+                <w:iCs/>
+                <w:color w:val="0D0D0D" w:themeColor="text1" w:themeTint="F2"/>
+              </w:rPr>
+              <w:t>есть</w:t>
+            </w:r>
+            <w:r>
+              <w:rPr>
+                <w:i/>
+                <w:iCs/>
+                <w:color w:val="0D0D0D" w:themeColor="text1" w:themeTint="F2"/>
+                <w:lang w:val="en-US"/>
+              </w:rPr>
+              <w:t xml:space="preserve"> Retrieval-Augmented Generation</w:t>
             </w:r>
           </w:p>
         </w:tc>
@@ -5213,31 +5504,109 @@
                 <w:i/>
                 <w:iCs/>
                 <w:color w:val="0D0D0D" w:themeColor="text1" w:themeTint="F2"/>
-              </w:rPr>
-            </w:pPr>
-            <w:r>
-              <w:rPr>
-                <w:i/>
-                <w:iCs/>
-                <w:color w:val="0D0D0D" w:themeColor="text1" w:themeTint="F2"/>
-              </w:rPr>
-              <w:t xml:space="preserve">OpenAI / </w:t>
-            </w:r>
-            <w:r>
-              <w:rPr>
-                <w:i/>
-                <w:iCs/>
-                <w:color w:val="0D0D0D" w:themeColor="text1" w:themeTint="F2"/>
+                <w:lang w:val="en-US"/>
+              </w:rPr>
+            </w:pPr>
+            <w:proofErr w:type="gramStart"/>
+            <w:r>
+              <w:rPr>
+                <w:i/>
+                <w:iCs/>
+                <w:color w:val="0D0D0D" w:themeColor="text1" w:themeTint="F2"/>
+                <w:lang w:val="en-US"/>
+              </w:rPr>
+              <w:t xml:space="preserve">OpenAI </w:t>
+            </w:r>
+            <w:r>
+              <w:rPr>
+                <w:i/>
+                <w:iCs/>
+                <w:color w:val="0D0D0D" w:themeColor="text1" w:themeTint="F2"/>
+                <w:lang w:val="en-US"/>
+              </w:rPr>
+              <w:t> gpt</w:t>
+            </w:r>
+            <w:proofErr w:type="gramEnd"/>
+            <w:r>
+              <w:rPr>
+                <w:i/>
+                <w:iCs/>
+                <w:color w:val="0D0D0D" w:themeColor="text1" w:themeTint="F2"/>
+                <w:lang w:val="en-US"/>
+              </w:rPr>
+              <w:t xml:space="preserve">-4o-nano (-mini) </w:t>
+            </w:r>
+            <w:r>
+              <w:rPr>
+                <w:i/>
+                <w:iCs/>
+                <w:color w:val="0D0D0D" w:themeColor="text1" w:themeTint="F2"/>
+                <w:lang w:val="en-US"/>
+              </w:rPr>
+              <w:t xml:space="preserve">/ </w:t>
+            </w:r>
+            <w:proofErr w:type="spellStart"/>
+            <w:r>
+              <w:rPr>
+                <w:i/>
+                <w:iCs/>
+                <w:color w:val="0D0D0D" w:themeColor="text1" w:themeTint="F2"/>
+                <w:lang w:val="en-US"/>
               </w:rPr>
               <w:t>gigaChat</w:t>
             </w:r>
-            <w:r>
-              <w:rPr>
-                <w:i/>
-                <w:iCs/>
-                <w:color w:val="0D0D0D" w:themeColor="text1" w:themeTint="F2"/>
-              </w:rPr>
-              <w:t xml:space="preserve"> / локальная LLM / другой доступный провайдер</w:t>
+            <w:proofErr w:type="spellEnd"/>
+            <w:r>
+              <w:rPr>
+                <w:i/>
+                <w:iCs/>
+                <w:color w:val="0D0D0D" w:themeColor="text1" w:themeTint="F2"/>
+                <w:lang w:val="en-US"/>
+              </w:rPr>
+              <w:t xml:space="preserve"> </w:t>
+            </w:r>
+            <w:r>
+              <w:rPr>
+                <w:i/>
+                <w:iCs/>
+                <w:color w:val="0D0D0D" w:themeColor="text1" w:themeTint="F2"/>
+                <w:lang w:val="en-US"/>
+              </w:rPr>
+              <w:t>(</w:t>
+            </w:r>
+            <w:r>
+              <w:rPr>
+                <w:i/>
+                <w:iCs/>
+                <w:color w:val="0D0D0D" w:themeColor="text1" w:themeTint="F2"/>
+              </w:rPr>
+              <w:t>как</w:t>
+            </w:r>
+            <w:r>
+              <w:rPr>
+                <w:i/>
+                <w:iCs/>
+                <w:color w:val="0D0D0D" w:themeColor="text1" w:themeTint="F2"/>
+                <w:lang w:val="en-US"/>
+              </w:rPr>
+              <w:t xml:space="preserve"> </w:t>
+            </w:r>
+            <w:r>
+              <w:rPr>
+                <w:i/>
+                <w:iCs/>
+                <w:color w:val="0D0D0D" w:themeColor="text1" w:themeTint="F2"/>
+              </w:rPr>
+              <w:t>резерв</w:t>
+            </w:r>
+            <w:r>
+              <w:rPr>
+                <w:i/>
+                <w:iCs/>
+                <w:color w:val="0D0D0D" w:themeColor="text1" w:themeTint="F2"/>
+                <w:lang w:val="en-US"/>
+              </w:rPr>
+              <w:t>)</w:t>
             </w:r>
           </w:p>
         </w:tc>
@@ -5306,6 +5675,7 @@
                 <w:color w:val="0D0D0D" w:themeColor="text1" w:themeTint="F2"/>
               </w:rPr>
             </w:pPr>
+            <w:proofErr w:type="spellStart"/>
             <w:r>
               <w:rPr>
                 <w:i/>
@@ -5314,6 +5684,7 @@
               </w:rPr>
               <w:t>Chroma</w:t>
             </w:r>
+            <w:proofErr w:type="spellEnd"/>
           </w:p>
         </w:tc>
       </w:tr>
@@ -5387,6 +5758,7 @@
                 <w:color w:val="0D0D0D" w:themeColor="text1" w:themeTint="F2"/>
               </w:rPr>
             </w:pPr>
+            <w:proofErr w:type="spellStart"/>
             <w:r>
               <w:rPr>
                 <w:i/>
@@ -5395,6 +5767,7 @@
               </w:rPr>
               <w:t>LangChain</w:t>
             </w:r>
+            <w:proofErr w:type="spellEnd"/>
           </w:p>
         </w:tc>
       </w:tr>
@@ -5421,26 +5794,19 @@
                 <w:b/>
                 <w:bCs/>
                 <w:color w:val="0D0D0D" w:themeColor="text1" w:themeTint="F2"/>
-                <w:lang w:val="en-US"/>
-              </w:rPr>
-            </w:pPr>
+              </w:rPr>
+            </w:pPr>
+            <w:proofErr w:type="spellStart"/>
             <w:r>
               <w:rPr>
                 <w:b/>
                 <w:bCs/>
                 <w:color w:val="0D0D0D" w:themeColor="text1" w:themeTint="F2"/>
               </w:rPr>
-              <w:t>Backend</w:t>
-            </w:r>
-            <w:r>
-              <w:rPr>
-                <w:b/>
-                <w:bCs/>
-                <w:color w:val="0D0D0D" w:themeColor="text1" w:themeTint="F2"/>
-                <w:lang w:val="en-US"/>
-              </w:rPr>
-              <w:t>:</w:t>
-            </w:r>
+              <w:lastRenderedPageBreak/>
+              <w:t>Эмбеддинги</w:t>
+            </w:r>
+            <w:proofErr w:type="spellEnd"/>
           </w:p>
         </w:tc>
         <w:tc>
@@ -5466,32 +5832,149 @@
                 <w:i/>
                 <w:iCs/>
                 <w:color w:val="0D0D0D" w:themeColor="text1" w:themeTint="F2"/>
-              </w:rPr>
-            </w:pPr>
-            <w:r>
-              <w:rPr>
-                <w:i/>
-                <w:iCs/>
-                <w:color w:val="0D0D0D" w:themeColor="text1" w:themeTint="F2"/>
-              </w:rPr>
-              <w:t>Python, FastAPI</w:t>
-            </w:r>
-            <w:r>
-              <w:rPr>
-                <w:i/>
-                <w:iCs/>
-                <w:color w:val="0D0D0D" w:themeColor="text1" w:themeTint="F2"/>
                 <w:lang w:val="en-US"/>
               </w:rPr>
-              <w:t>,</w:t>
-            </w:r>
-            <w:r>
-              <w:rPr>
-                <w:i/>
-                <w:iCs/>
-                <w:color w:val="0D0D0D" w:themeColor="text1" w:themeTint="F2"/>
-              </w:rPr>
-              <w:t xml:space="preserve"> Flask</w:t>
+            </w:pPr>
+            <w:r>
+              <w:rPr>
+                <w:i/>
+                <w:iCs/>
+                <w:color w:val="0D0D0D" w:themeColor="text1" w:themeTint="F2"/>
+                <w:lang w:val="en-US"/>
+              </w:rPr>
+              <w:t xml:space="preserve">OpenAI </w:t>
+            </w:r>
+            <w:r>
+              <w:rPr>
+                <w:i/>
+                <w:iCs/>
+                <w:color w:val="0D0D0D" w:themeColor="text1" w:themeTint="F2"/>
+                <w:lang w:val="en-US"/>
+              </w:rPr>
+              <w:t>text-embedding-3-small</w:t>
+            </w:r>
+            <w:r>
+              <w:rPr>
+                <w:i/>
+                <w:iCs/>
+                <w:color w:val="0D0D0D" w:themeColor="text1" w:themeTint="F2"/>
+                <w:lang w:val="en-US"/>
+              </w:rPr>
+              <w:t xml:space="preserve"> / </w:t>
+            </w:r>
+            <w:r>
+              <w:rPr>
+                <w:i/>
+                <w:iCs/>
+                <w:color w:val="0D0D0D" w:themeColor="text1" w:themeTint="F2"/>
+                <w:lang w:val="en-US"/>
+              </w:rPr>
+              <w:t>Hugging Face</w:t>
+            </w:r>
+            <w:r>
+              <w:rPr>
+                <w:i/>
+                <w:iCs/>
+                <w:color w:val="0D0D0D" w:themeColor="text1" w:themeTint="F2"/>
+                <w:lang w:val="en-US"/>
+              </w:rPr>
+              <w:t xml:space="preserve"> </w:t>
+            </w:r>
+            <w:r>
+              <w:rPr>
+                <w:i/>
+                <w:iCs/>
+                <w:color w:val="0D0D0D" w:themeColor="text1" w:themeTint="F2"/>
+                <w:lang w:val="en-US"/>
+              </w:rPr>
+              <w:t>sentence-transformers/paraphrase-multilingual-MiniLM-L12-v2</w:t>
+            </w:r>
+            <w:r>
+              <w:rPr>
+                <w:i/>
+                <w:iCs/>
+                <w:color w:val="0D0D0D" w:themeColor="text1" w:themeTint="F2"/>
+                <w:lang w:val="en-US"/>
+              </w:rPr>
+              <w:t xml:space="preserve"> (</w:t>
+            </w:r>
+            <w:r>
+              <w:rPr>
+                <w:i/>
+                <w:iCs/>
+                <w:color w:val="0D0D0D" w:themeColor="text1" w:themeTint="F2"/>
+              </w:rPr>
+              <w:t>в</w:t>
+            </w:r>
+            <w:r>
+              <w:rPr>
+                <w:i/>
+                <w:iCs/>
+                <w:color w:val="0D0D0D" w:themeColor="text1" w:themeTint="F2"/>
+                <w:lang w:val="en-US"/>
+              </w:rPr>
+              <w:t xml:space="preserve"> </w:t>
+            </w:r>
+            <w:r>
+              <w:rPr>
+                <w:i/>
+                <w:iCs/>
+                <w:color w:val="0D0D0D" w:themeColor="text1" w:themeTint="F2"/>
+              </w:rPr>
+              <w:t>случае</w:t>
+            </w:r>
+            <w:r>
+              <w:rPr>
+                <w:i/>
+                <w:iCs/>
+                <w:color w:val="0D0D0D" w:themeColor="text1" w:themeTint="F2"/>
+                <w:lang w:val="en-US"/>
+              </w:rPr>
+              <w:t xml:space="preserve"> </w:t>
+            </w:r>
+            <w:r>
+              <w:rPr>
+                <w:i/>
+                <w:iCs/>
+                <w:color w:val="0D0D0D" w:themeColor="text1" w:themeTint="F2"/>
+              </w:rPr>
+              <w:t>недоступности</w:t>
+            </w:r>
+            <w:r>
+              <w:rPr>
+                <w:i/>
+                <w:iCs/>
+                <w:color w:val="0D0D0D" w:themeColor="text1" w:themeTint="F2"/>
+                <w:lang w:val="en-US"/>
+              </w:rPr>
+              <w:t xml:space="preserve"> </w:t>
+            </w:r>
+            <w:r>
+              <w:rPr>
+                <w:i/>
+                <w:iCs/>
+                <w:color w:val="0D0D0D" w:themeColor="text1" w:themeTint="F2"/>
+                <w:lang w:val="en-US"/>
+              </w:rPr>
+              <w:t>OpenAI</w:t>
+            </w:r>
+            <w:r>
+              <w:rPr>
+                <w:i/>
+                <w:iCs/>
+                <w:color w:val="0D0D0D" w:themeColor="text1" w:themeTint="F2"/>
+                <w:lang w:val="en-US"/>
+              </w:rPr>
+              <w:t>)</w:t>
+            </w:r>
+            <w:r>
+              <w:rPr>
+                <w:i/>
+                <w:iCs/>
+                <w:color w:val="0D0D0D" w:themeColor="text1" w:themeTint="F2"/>
+                <w:lang w:val="en-US"/>
+              </w:rPr>
+              <w:t xml:space="preserve"> </w:t>
             </w:r>
           </w:p>
         </w:tc>
@@ -5519,7 +6002,6 @@
                 <w:b/>
                 <w:bCs/>
                 <w:color w:val="0D0D0D" w:themeColor="text1" w:themeTint="F2"/>
-                <w:lang w:val="en-US"/>
               </w:rPr>
             </w:pPr>
             <w:r>
@@ -5528,17 +6010,7 @@
                 <w:bCs/>
                 <w:color w:val="0D0D0D" w:themeColor="text1" w:themeTint="F2"/>
               </w:rPr>
-              <w:lastRenderedPageBreak/>
-              <w:t>Хранение документов</w:t>
-            </w:r>
-            <w:r>
-              <w:rPr>
-                <w:b/>
-                <w:bCs/>
-                <w:color w:val="0D0D0D" w:themeColor="text1" w:themeTint="F2"/>
-                <w:lang w:val="en-US"/>
-              </w:rPr>
-              <w:t>:</w:t>
+              <w:t>Память ассистента и прочее хранение</w:t>
             </w:r>
           </w:p>
         </w:tc>
@@ -5567,14 +6039,17 @@
                 <w:color w:val="0D0D0D" w:themeColor="text1" w:themeTint="F2"/>
               </w:rPr>
             </w:pPr>
-            <w:r>
-              <w:rPr>
-                <w:i/>
-                <w:iCs/>
-                <w:color w:val="0D0D0D" w:themeColor="text1" w:themeTint="F2"/>
-              </w:rPr>
-              <w:t>Локальное хранилище</w:t>
-            </w:r>
+            <w:proofErr w:type="spellStart"/>
+            <w:r>
+              <w:rPr>
+                <w:i/>
+                <w:iCs/>
+                <w:color w:val="0D0D0D" w:themeColor="text1" w:themeTint="F2"/>
+                <w:lang w:val="en-US"/>
+              </w:rPr>
+              <w:t>SQLLite</w:t>
+            </w:r>
+            <w:proofErr w:type="spellEnd"/>
           </w:p>
         </w:tc>
       </w:tr>
@@ -5598,16 +6073,30 @@
           <w:p>
             <w:pPr>
               <w:rPr>
-                <w:color w:val="0D0D0D" w:themeColor="text1" w:themeTint="F2"/>
-              </w:rPr>
-            </w:pPr>
-            <w:r>
-              <w:rPr>
                 <w:b/>
                 <w:bCs/>
                 <w:color w:val="0D0D0D" w:themeColor="text1" w:themeTint="F2"/>
-              </w:rPr>
-              <w:t>Интеграции:</w:t>
+                <w:lang w:val="en-US"/>
+              </w:rPr>
+            </w:pPr>
+            <w:proofErr w:type="spellStart"/>
+            <w:r>
+              <w:rPr>
+                <w:b/>
+                <w:bCs/>
+                <w:color w:val="0D0D0D" w:themeColor="text1" w:themeTint="F2"/>
+              </w:rPr>
+              <w:t>Backend</w:t>
+            </w:r>
+            <w:proofErr w:type="spellEnd"/>
+            <w:r>
+              <w:rPr>
+                <w:b/>
+                <w:bCs/>
+                <w:color w:val="0D0D0D" w:themeColor="text1" w:themeTint="F2"/>
+                <w:lang w:val="en-US"/>
+              </w:rPr>
+              <w:t>:</w:t>
             </w:r>
           </w:p>
         </w:tc>
@@ -5631,17 +6120,56 @@
           <w:p>
             <w:pPr>
               <w:rPr>
-                <w:color w:val="0D0D0D" w:themeColor="text1" w:themeTint="F2"/>
-              </w:rPr>
-            </w:pPr>
-            <w:r>
-              <w:rPr>
-                <w:i/>
-                <w:iCs/>
-                <w:color w:val="0D0D0D" w:themeColor="text1" w:themeTint="F2"/>
-              </w:rPr>
-              <w:t>Telegram Bot API или веб-интерфейс</w:t>
-            </w:r>
+                <w:i/>
+                <w:iCs/>
+                <w:color w:val="0D0D0D" w:themeColor="text1" w:themeTint="F2"/>
+              </w:rPr>
+            </w:pPr>
+            <w:r>
+              <w:rPr>
+                <w:i/>
+                <w:iCs/>
+                <w:color w:val="0D0D0D" w:themeColor="text1" w:themeTint="F2"/>
+              </w:rPr>
+              <w:t xml:space="preserve">Python, </w:t>
+            </w:r>
+            <w:proofErr w:type="spellStart"/>
+            <w:r>
+              <w:rPr>
+                <w:i/>
+                <w:iCs/>
+                <w:color w:val="0D0D0D" w:themeColor="text1" w:themeTint="F2"/>
+              </w:rPr>
+              <w:t>FastAPI</w:t>
+            </w:r>
+            <w:proofErr w:type="spellEnd"/>
+            <w:r>
+              <w:rPr>
+                <w:i/>
+                <w:iCs/>
+                <w:color w:val="0D0D0D" w:themeColor="text1" w:themeTint="F2"/>
+                <w:lang w:val="en-US"/>
+              </w:rPr>
+              <w:t>,</w:t>
+            </w:r>
+            <w:r>
+              <w:rPr>
+                <w:i/>
+                <w:iCs/>
+                <w:color w:val="0D0D0D" w:themeColor="text1" w:themeTint="F2"/>
+              </w:rPr>
+              <w:t xml:space="preserve"> </w:t>
+            </w:r>
+            <w:proofErr w:type="spellStart"/>
+            <w:r>
+              <w:rPr>
+                <w:i/>
+                <w:iCs/>
+                <w:color w:val="0D0D0D" w:themeColor="text1" w:themeTint="F2"/>
+              </w:rPr>
+              <w:t>Flask</w:t>
+            </w:r>
+            <w:proofErr w:type="spellEnd"/>
           </w:p>
         </w:tc>
       </w:tr>
@@ -5677,7 +6205,7 @@
                 <w:bCs/>
                 <w:color w:val="0D0D0D" w:themeColor="text1" w:themeTint="F2"/>
               </w:rPr>
-              <w:t>Возможные интеграции позже</w:t>
+              <w:t>Хранение документов</w:t>
             </w:r>
             <w:r>
               <w:rPr>
@@ -5721,7 +6249,201 @@
                 <w:iCs/>
                 <w:color w:val="0D0D0D" w:themeColor="text1" w:themeTint="F2"/>
               </w:rPr>
-              <w:t>CRM, медицинская информационная система, Google Sheets, календарь записи</w:t>
+              <w:t>Локальное хранилище</w:t>
+            </w:r>
+          </w:p>
+        </w:tc>
+      </w:tr>
+      <w:tr>
+        <w:tc>
+          <w:tcPr>
+            <w:tcW w:w="4513" w:type="dxa"/>
+            <w:tcBorders>
+              <w:top w:val="nil"/>
+              <w:left w:val="nil"/>
+              <w:bottom w:val="nil"/>
+              <w:right w:val="nil"/>
+            </w:tcBorders>
+            <w:tcMar>
+              <w:top w:w="100" w:type="dxa"/>
+              <w:left w:w="120" w:type="dxa"/>
+              <w:bottom w:w="100" w:type="dxa"/>
+              <w:right w:w="120" w:type="dxa"/>
+            </w:tcMar>
+          </w:tcPr>
+          <w:p>
+            <w:pPr>
+              <w:rPr>
+                <w:color w:val="0D0D0D" w:themeColor="text1" w:themeTint="F2"/>
+              </w:rPr>
+            </w:pPr>
+            <w:r>
+              <w:rPr>
+                <w:b/>
+                <w:bCs/>
+                <w:color w:val="0D0D0D" w:themeColor="text1" w:themeTint="F2"/>
+              </w:rPr>
+              <w:t>Интеграции:</w:t>
+            </w:r>
+          </w:p>
+        </w:tc>
+        <w:tc>
+          <w:tcPr>
+            <w:tcW w:w="4513" w:type="dxa"/>
+            <w:tcBorders>
+              <w:top w:val="single" w:sz="4" w:space="0" w:color="CCCCCC"/>
+              <w:left w:val="single" w:sz="4" w:space="0" w:color="CCCCCC"/>
+              <w:bottom w:val="single" w:sz="4" w:space="0" w:color="CCCCCC"/>
+              <w:right w:val="single" w:sz="4" w:space="0" w:color="CCCCCC"/>
+            </w:tcBorders>
+            <w:shd w:val="clear" w:color="auto" w:fill="F5F5F5"/>
+            <w:tcMar>
+              <w:top w:w="100" w:type="dxa"/>
+              <w:left w:w="120" w:type="dxa"/>
+              <w:bottom w:w="100" w:type="dxa"/>
+              <w:right w:w="120" w:type="dxa"/>
+            </w:tcMar>
+          </w:tcPr>
+          <w:p>
+            <w:pPr>
+              <w:rPr>
+                <w:color w:val="0D0D0D" w:themeColor="text1" w:themeTint="F2"/>
+              </w:rPr>
+            </w:pPr>
+            <w:proofErr w:type="spellStart"/>
+            <w:r>
+              <w:rPr>
+                <w:i/>
+                <w:iCs/>
+                <w:color w:val="0D0D0D" w:themeColor="text1" w:themeTint="F2"/>
+              </w:rPr>
+              <w:t>Telegram</w:t>
+            </w:r>
+            <w:proofErr w:type="spellEnd"/>
+            <w:r>
+              <w:rPr>
+                <w:i/>
+                <w:iCs/>
+                <w:color w:val="0D0D0D" w:themeColor="text1" w:themeTint="F2"/>
+              </w:rPr>
+              <w:t xml:space="preserve"> </w:t>
+            </w:r>
+            <w:proofErr w:type="spellStart"/>
+            <w:r>
+              <w:rPr>
+                <w:i/>
+                <w:iCs/>
+                <w:color w:val="0D0D0D" w:themeColor="text1" w:themeTint="F2"/>
+              </w:rPr>
+              <w:t>Bot</w:t>
+            </w:r>
+            <w:proofErr w:type="spellEnd"/>
+            <w:r>
+              <w:rPr>
+                <w:i/>
+                <w:iCs/>
+                <w:color w:val="0D0D0D" w:themeColor="text1" w:themeTint="F2"/>
+              </w:rPr>
+              <w:t xml:space="preserve"> API или веб-интерфейс</w:t>
+            </w:r>
+          </w:p>
+        </w:tc>
+      </w:tr>
+      <w:tr>
+        <w:tc>
+          <w:tcPr>
+            <w:tcW w:w="4513" w:type="dxa"/>
+            <w:tcBorders>
+              <w:top w:val="nil"/>
+              <w:left w:val="nil"/>
+              <w:bottom w:val="nil"/>
+              <w:right w:val="nil"/>
+            </w:tcBorders>
+            <w:tcMar>
+              <w:top w:w="100" w:type="dxa"/>
+              <w:left w:w="120" w:type="dxa"/>
+              <w:bottom w:w="100" w:type="dxa"/>
+              <w:right w:w="120" w:type="dxa"/>
+            </w:tcMar>
+          </w:tcPr>
+          <w:p>
+            <w:pPr>
+              <w:rPr>
+                <w:b/>
+                <w:bCs/>
+                <w:color w:val="0D0D0D" w:themeColor="text1" w:themeTint="F2"/>
+                <w:lang w:val="en-US"/>
+              </w:rPr>
+            </w:pPr>
+            <w:r>
+              <w:rPr>
+                <w:b/>
+                <w:bCs/>
+                <w:color w:val="0D0D0D" w:themeColor="text1" w:themeTint="F2"/>
+              </w:rPr>
+              <w:t>Возможные интеграции позже</w:t>
+            </w:r>
+            <w:r>
+              <w:rPr>
+                <w:b/>
+                <w:bCs/>
+                <w:color w:val="0D0D0D" w:themeColor="text1" w:themeTint="F2"/>
+                <w:lang w:val="en-US"/>
+              </w:rPr>
+              <w:t>:</w:t>
+            </w:r>
+          </w:p>
+        </w:tc>
+        <w:tc>
+          <w:tcPr>
+            <w:tcW w:w="4513" w:type="dxa"/>
+            <w:tcBorders>
+              <w:top w:val="single" w:sz="4" w:space="0" w:color="CCCCCC"/>
+              <w:left w:val="single" w:sz="4" w:space="0" w:color="CCCCCC"/>
+              <w:bottom w:val="single" w:sz="4" w:space="0" w:color="CCCCCC"/>
+              <w:right w:val="single" w:sz="4" w:space="0" w:color="CCCCCC"/>
+            </w:tcBorders>
+            <w:shd w:val="clear" w:color="auto" w:fill="F5F5F5"/>
+            <w:tcMar>
+              <w:top w:w="100" w:type="dxa"/>
+              <w:left w:w="120" w:type="dxa"/>
+              <w:bottom w:w="100" w:type="dxa"/>
+              <w:right w:w="120" w:type="dxa"/>
+            </w:tcMar>
+          </w:tcPr>
+          <w:p>
+            <w:pPr>
+              <w:rPr>
+                <w:i/>
+                <w:iCs/>
+                <w:color w:val="0D0D0D" w:themeColor="text1" w:themeTint="F2"/>
+              </w:rPr>
+            </w:pPr>
+            <w:r>
+              <w:rPr>
+                <w:i/>
+                <w:iCs/>
+                <w:color w:val="0D0D0D" w:themeColor="text1" w:themeTint="F2"/>
+              </w:rPr>
+              <w:t xml:space="preserve">CRM, медицинская информационная система, Google </w:t>
+            </w:r>
+            <w:proofErr w:type="spellStart"/>
+            <w:r>
+              <w:rPr>
+                <w:i/>
+                <w:iCs/>
+                <w:color w:val="0D0D0D" w:themeColor="text1" w:themeTint="F2"/>
+              </w:rPr>
+              <w:t>Sheets</w:t>
+            </w:r>
+            <w:proofErr w:type="spellEnd"/>
+            <w:r>
+              <w:rPr>
+                <w:i/>
+                <w:iCs/>
+                <w:color w:val="0D0D0D" w:themeColor="text1" w:themeTint="F2"/>
+              </w:rPr>
+              <w:t>, календарь записи</w:t>
             </w:r>
           </w:p>
         </w:tc>
@@ -6207,7 +6929,6 @@
                 <w:i/>
                 <w:iCs/>
                 <w:color w:val="0D0D0D" w:themeColor="text1" w:themeTint="F2"/>
-                <w:lang w:val="en-US"/>
               </w:rPr>
             </w:pPr>
             <w:r>
@@ -6235,7 +6956,34 @@
                 <w:color w:val="0D0D0D" w:themeColor="text1" w:themeTint="F2"/>
               </w:rPr>
               <w:br/>
-              <w:t>Для дипломного проекта бюджет может быть ограничен бесплатными или недорогими инструментами. Например, можно использовать локальную векторную базу FAISS или Chroma.</w:t>
+              <w:t xml:space="preserve">Для дипломного проекта бюджет может быть ограничен бесплатными или </w:t>
+            </w:r>
+            <w:r>
+              <w:rPr>
+                <w:i/>
+                <w:iCs/>
+                <w:color w:val="0D0D0D" w:themeColor="text1" w:themeTint="F2"/>
+              </w:rPr>
+              <w:lastRenderedPageBreak/>
+              <w:t xml:space="preserve">недорогими инструментами. Например, можно использовать локальную векторную базу FAISS или </w:t>
+            </w:r>
+            <w:proofErr w:type="spellStart"/>
+            <w:r>
+              <w:rPr>
+                <w:i/>
+                <w:iCs/>
+                <w:color w:val="0D0D0D" w:themeColor="text1" w:themeTint="F2"/>
+              </w:rPr>
+              <w:t>Chroma</w:t>
+            </w:r>
+            <w:proofErr w:type="spellEnd"/>
+            <w:r>
+              <w:rPr>
+                <w:i/>
+                <w:iCs/>
+                <w:color w:val="0D0D0D" w:themeColor="text1" w:themeTint="F2"/>
+              </w:rPr>
+              <w:t>.</w:t>
             </w:r>
           </w:p>
           <w:p>
@@ -6246,7 +6994,6 @@
                 <w:i/>
                 <w:iCs/>
                 <w:color w:val="0D0D0D" w:themeColor="text1" w:themeTint="F2"/>
-                <w:lang w:val="en-US"/>
               </w:rPr>
             </w:pPr>
             <w:r>
@@ -6258,159 +7005,8 @@
                 <w:color w:val="0D0D0D" w:themeColor="text1" w:themeTint="F2"/>
                 <w:lang w:val="en-US"/>
               </w:rPr>
-              <w:t>AI Model:</w:t>
-            </w:r>
-          </w:p>
-          <w:p>
-            <w:pPr>
-              <w:rPr>
-                <w:i/>
-                <w:iCs/>
-                <w:color w:val="0D0D0D" w:themeColor="text1" w:themeTint="F2"/>
-              </w:rPr>
-            </w:pPr>
-            <w:r>
-              <w:rPr>
-                <w:i/>
-                <w:iCs/>
-                <w:color w:val="0D0D0D" w:themeColor="text1" w:themeTint="F2"/>
-                <w:lang w:val="en-US"/>
-              </w:rPr>
-              <w:t>gpt</w:t>
-            </w:r>
-            <w:r>
-              <w:rPr>
-                <w:i/>
-                <w:iCs/>
-                <w:color w:val="0D0D0D" w:themeColor="text1" w:themeTint="F2"/>
-              </w:rPr>
-              <w:t>-5.4-</w:t>
-            </w:r>
-            <w:r>
-              <w:rPr>
-                <w:i/>
-                <w:iCs/>
-                <w:color w:val="0D0D0D" w:themeColor="text1" w:themeTint="F2"/>
-                <w:lang w:val="en-US"/>
-              </w:rPr>
-              <w:t>nano</w:t>
-            </w:r>
-            <w:r>
-              <w:rPr>
-                <w:i/>
-                <w:iCs/>
-                <w:color w:val="0D0D0D" w:themeColor="text1" w:themeTint="F2"/>
-              </w:rPr>
-              <w:t>-2026-03-17</w:t>
-            </w:r>
-            <w:r>
-              <w:rPr>
-                <w:i/>
-                <w:iCs/>
-                <w:color w:val="0D0D0D" w:themeColor="text1" w:themeTint="F2"/>
-              </w:rPr>
-              <w:t xml:space="preserve"> </w:t>
-            </w:r>
-            <w:r>
-              <w:rPr>
-                <w:i/>
-                <w:iCs/>
-                <w:color w:val="0D0D0D" w:themeColor="text1" w:themeTint="F2"/>
-              </w:rPr>
-              <w:t>или</w:t>
-            </w:r>
-            <w:r>
-              <w:rPr>
-                <w:i/>
-                <w:iCs/>
-                <w:color w:val="0D0D0D" w:themeColor="text1" w:themeTint="F2"/>
-              </w:rPr>
-              <w:t xml:space="preserve"> </w:t>
-            </w:r>
-            <w:r>
-              <w:rPr>
-                <w:i/>
-                <w:iCs/>
-                <w:color w:val="0D0D0D" w:themeColor="text1" w:themeTint="F2"/>
-                <w:lang w:val="en-US"/>
-              </w:rPr>
-              <w:t>gpt</w:t>
-            </w:r>
-            <w:r>
-              <w:rPr>
-                <w:i/>
-                <w:iCs/>
-                <w:color w:val="0D0D0D" w:themeColor="text1" w:themeTint="F2"/>
-              </w:rPr>
-              <w:t>-5.4-</w:t>
-            </w:r>
-            <w:r>
-              <w:rPr>
-                <w:i/>
-                <w:iCs/>
-                <w:color w:val="0D0D0D" w:themeColor="text1" w:themeTint="F2"/>
-                <w:lang w:val="en-US"/>
-              </w:rPr>
-              <w:t>mini</w:t>
-            </w:r>
-            <w:r>
-              <w:rPr>
-                <w:i/>
-                <w:iCs/>
-                <w:color w:val="0D0D0D" w:themeColor="text1" w:themeTint="F2"/>
-              </w:rPr>
-              <w:t>-2026-03-17</w:t>
-            </w:r>
-            <w:r>
-              <w:rPr>
-                <w:i/>
-                <w:iCs/>
-                <w:color w:val="0D0D0D" w:themeColor="text1" w:themeTint="F2"/>
-              </w:rPr>
-              <w:t xml:space="preserve"> (</w:t>
-            </w:r>
-            <w:r>
-              <w:rPr>
-                <w:i/>
-                <w:iCs/>
-                <w:color w:val="0D0D0D" w:themeColor="text1" w:themeTint="F2"/>
-              </w:rPr>
-              <w:t xml:space="preserve">настраивается в </w:t>
-            </w:r>
-            <w:r>
-              <w:rPr>
-                <w:i/>
-                <w:iCs/>
-                <w:color w:val="0D0D0D" w:themeColor="text1" w:themeTint="F2"/>
-              </w:rPr>
-              <w:t>.</w:t>
-            </w:r>
-            <w:r>
-              <w:rPr>
-                <w:i/>
-                <w:iCs/>
-                <w:color w:val="0D0D0D" w:themeColor="text1" w:themeTint="F2"/>
-                <w:lang w:val="en-US"/>
-              </w:rPr>
-              <w:t>env</w:t>
-            </w:r>
-            <w:r>
-              <w:rPr>
-                <w:i/>
-                <w:iCs/>
-                <w:color w:val="0D0D0D" w:themeColor="text1" w:themeTint="F2"/>
-              </w:rPr>
-              <w:t xml:space="preserve"> файле)</w:t>
-            </w:r>
-          </w:p>
-          <w:p>
-            <w:pPr>
-              <w:rPr>
-                <w:i/>
-                <w:iCs/>
-                <w:color w:val="0D0D0D" w:themeColor="text1" w:themeTint="F2"/>
-              </w:rPr>
-            </w:pPr>
+              <w:t>AI</w:t>
+            </w:r>
             <w:r>
               <w:rPr>
                 <w:b/>
@@ -6419,6 +7015,186 @@
                 <w:iCs/>
                 <w:color w:val="0D0D0D" w:themeColor="text1" w:themeTint="F2"/>
               </w:rPr>
+              <w:t xml:space="preserve"> </w:t>
+            </w:r>
+            <w:r>
+              <w:rPr>
+                <w:b/>
+                <w:bCs/>
+                <w:i/>
+                <w:iCs/>
+                <w:color w:val="0D0D0D" w:themeColor="text1" w:themeTint="F2"/>
+                <w:lang w:val="en-US"/>
+              </w:rPr>
+              <w:t>Model</w:t>
+            </w:r>
+            <w:r>
+              <w:rPr>
+                <w:b/>
+                <w:bCs/>
+                <w:i/>
+                <w:iCs/>
+                <w:color w:val="0D0D0D" w:themeColor="text1" w:themeTint="F2"/>
+              </w:rPr>
+              <w:t>:</w:t>
+            </w:r>
+          </w:p>
+          <w:p>
+            <w:pPr>
+              <w:rPr>
+                <w:i/>
+                <w:iCs/>
+                <w:color w:val="0D0D0D" w:themeColor="text1" w:themeTint="F2"/>
+              </w:rPr>
+            </w:pPr>
+            <w:proofErr w:type="spellStart"/>
+            <w:r>
+              <w:rPr>
+                <w:i/>
+                <w:iCs/>
+                <w:color w:val="0D0D0D" w:themeColor="text1" w:themeTint="F2"/>
+                <w:lang w:val="en-US"/>
+              </w:rPr>
+              <w:t>gpt</w:t>
+            </w:r>
+            <w:proofErr w:type="spellEnd"/>
+            <w:r>
+              <w:rPr>
+                <w:i/>
+                <w:iCs/>
+                <w:color w:val="0D0D0D" w:themeColor="text1" w:themeTint="F2"/>
+              </w:rPr>
+              <w:t>-5.4-</w:t>
+            </w:r>
+            <w:r>
+              <w:rPr>
+                <w:i/>
+                <w:iCs/>
+                <w:color w:val="0D0D0D" w:themeColor="text1" w:themeTint="F2"/>
+                <w:lang w:val="en-US"/>
+              </w:rPr>
+              <w:t>nano</w:t>
+            </w:r>
+            <w:r>
+              <w:rPr>
+                <w:i/>
+                <w:iCs/>
+                <w:color w:val="0D0D0D" w:themeColor="text1" w:themeTint="F2"/>
+              </w:rPr>
+              <w:t xml:space="preserve">-2026-03-17 </w:t>
+            </w:r>
+            <w:r>
+              <w:rPr>
+                <w:i/>
+                <w:iCs/>
+                <w:color w:val="0D0D0D" w:themeColor="text1" w:themeTint="F2"/>
+              </w:rPr>
+              <w:t>или</w:t>
+            </w:r>
+            <w:r>
+              <w:rPr>
+                <w:i/>
+                <w:iCs/>
+                <w:color w:val="0D0D0D" w:themeColor="text1" w:themeTint="F2"/>
+              </w:rPr>
+              <w:t xml:space="preserve"> </w:t>
+            </w:r>
+            <w:proofErr w:type="spellStart"/>
+            <w:r>
+              <w:rPr>
+                <w:i/>
+                <w:iCs/>
+                <w:color w:val="0D0D0D" w:themeColor="text1" w:themeTint="F2"/>
+                <w:lang w:val="en-US"/>
+              </w:rPr>
+              <w:t>gpt</w:t>
+            </w:r>
+            <w:proofErr w:type="spellEnd"/>
+            <w:r>
+              <w:rPr>
+                <w:i/>
+                <w:iCs/>
+                <w:color w:val="0D0D0D" w:themeColor="text1" w:themeTint="F2"/>
+              </w:rPr>
+              <w:t>-5.4-</w:t>
+            </w:r>
+            <w:r>
+              <w:rPr>
+                <w:i/>
+                <w:iCs/>
+                <w:color w:val="0D0D0D" w:themeColor="text1" w:themeTint="F2"/>
+                <w:lang w:val="en-US"/>
+              </w:rPr>
+              <w:t>mini</w:t>
+            </w:r>
+            <w:r>
+              <w:rPr>
+                <w:i/>
+                <w:iCs/>
+                <w:color w:val="0D0D0D" w:themeColor="text1" w:themeTint="F2"/>
+              </w:rPr>
+              <w:t>-2026-03-17 (</w:t>
+            </w:r>
+            <w:r>
+              <w:rPr>
+                <w:i/>
+                <w:iCs/>
+                <w:color w:val="0D0D0D" w:themeColor="text1" w:themeTint="F2"/>
+              </w:rPr>
+              <w:t xml:space="preserve">настраивается </w:t>
+            </w:r>
+            <w:proofErr w:type="gramStart"/>
+            <w:r>
+              <w:rPr>
+                <w:i/>
+                <w:iCs/>
+                <w:color w:val="0D0D0D" w:themeColor="text1" w:themeTint="F2"/>
+              </w:rPr>
+              <w:t xml:space="preserve">в </w:t>
+            </w:r>
+            <w:r>
+              <w:rPr>
+                <w:i/>
+                <w:iCs/>
+                <w:color w:val="0D0D0D" w:themeColor="text1" w:themeTint="F2"/>
+              </w:rPr>
+              <w:t>.</w:t>
+            </w:r>
+            <w:r>
+              <w:rPr>
+                <w:i/>
+                <w:iCs/>
+                <w:color w:val="0D0D0D" w:themeColor="text1" w:themeTint="F2"/>
+                <w:lang w:val="en-US"/>
+              </w:rPr>
+              <w:t>env</w:t>
+            </w:r>
+            <w:proofErr w:type="gramEnd"/>
+            <w:r>
+              <w:rPr>
+                <w:i/>
+                <w:iCs/>
+                <w:color w:val="0D0D0D" w:themeColor="text1" w:themeTint="F2"/>
+              </w:rPr>
+              <w:t xml:space="preserve"> файле)</w:t>
+            </w:r>
+          </w:p>
+          <w:p>
+            <w:pPr>
+              <w:rPr>
+                <w:i/>
+                <w:iCs/>
+                <w:color w:val="0D0D0D" w:themeColor="text1" w:themeTint="F2"/>
+              </w:rPr>
+            </w:pPr>
+            <w:r>
+              <w:rPr>
+                <w:b/>
+                <w:bCs/>
+                <w:i/>
+                <w:iCs/>
+                <w:color w:val="0D0D0D" w:themeColor="text1" w:themeTint="F2"/>
+              </w:rPr>
               <w:t>Сроки:</w:t>
             </w:r>
             <w:r>
@@ -6469,6 +7245,61 @@
                 <w:color w:val="0D0D0D" w:themeColor="text1" w:themeTint="F2"/>
               </w:rPr>
               <w:t>.</w:t>
+            </w:r>
+          </w:p>
+          <w:p>
+            <w:pPr>
+              <w:rPr>
+                <w:b/>
+                <w:bCs/>
+                <w:i/>
+                <w:iCs/>
+                <w:color w:val="0D0D0D" w:themeColor="text1" w:themeTint="F2"/>
+              </w:rPr>
+            </w:pPr>
+            <w:r>
+              <w:rPr>
+                <w:b/>
+                <w:bCs/>
+                <w:i/>
+                <w:iCs/>
+                <w:color w:val="0D0D0D" w:themeColor="text1" w:themeTint="F2"/>
+              </w:rPr>
+              <w:t>Персональные данные:</w:t>
+            </w:r>
+          </w:p>
+          <w:p>
+            <w:pPr>
+              <w:rPr>
+                <w:i/>
+                <w:iCs/>
+                <w:color w:val="0D0D0D" w:themeColor="text1" w:themeTint="F2"/>
+              </w:rPr>
+            </w:pPr>
+            <w:r>
+              <w:rPr>
+                <w:i/>
+                <w:iCs/>
+                <w:color w:val="0D0D0D" w:themeColor="text1" w:themeTint="F2"/>
+              </w:rPr>
+              <w:t xml:space="preserve">В связи с ФЗ-153 в </w:t>
+            </w:r>
+            <w:r>
+              <w:rPr>
+                <w:i/>
+                <w:iCs/>
+                <w:color w:val="0D0D0D" w:themeColor="text1" w:themeTint="F2"/>
+                <w:lang w:val="en-US"/>
+              </w:rPr>
+              <w:t>AI</w:t>
+            </w:r>
+            <w:r>
+              <w:rPr>
+                <w:i/>
+                <w:iCs/>
+                <w:color w:val="0D0D0D" w:themeColor="text1" w:themeTint="F2"/>
+              </w:rPr>
+              <w:t xml:space="preserve">-ассистенте отсутствует хранение и обработка персональных данных. </w:t>
             </w:r>
           </w:p>
           <w:p>
@@ -6552,7 +7383,6 @@
                 <w:iCs/>
                 <w:color w:val="0D0D0D" w:themeColor="text1" w:themeTint="F2"/>
               </w:rPr>
-              <w:lastRenderedPageBreak/>
               <w:t>ограниченный объём базы знаний;</w:t>
             </w:r>
           </w:p>
@@ -6660,8 +7490,19 @@
           <w:sz w:val="24"/>
           <w:szCs w:val="24"/>
         </w:rPr>
-        <w:t>7.2 Риски и митигация</w:t>
+        <w:t xml:space="preserve">7.2 Риски и </w:t>
       </w:r>
+      <w:proofErr w:type="spellStart"/>
+      <w:r>
+        <w:rPr>
+          <w:b/>
+          <w:bCs/>
+          <w:sz w:val="24"/>
+          <w:szCs w:val="24"/>
+        </w:rPr>
+        <w:t>митигация</w:t>
+      </w:r>
+      <w:proofErr w:type="spellEnd"/>
     </w:p>
     <w:tbl>
       <w:tblPr>
@@ -6757,6 +7598,7 @@
             </w:tcMar>
           </w:tcPr>
           <w:p>
+            <w:proofErr w:type="spellStart"/>
             <w:r>
               <w:rPr>
                 <w:b/>
@@ -6764,6 +7606,7 @@
               </w:rPr>
               <w:t>Митигация</w:t>
             </w:r>
+            <w:proofErr w:type="spellEnd"/>
           </w:p>
         </w:tc>
       </w:tr>
@@ -7168,7 +8011,25 @@
                 <w:iCs/>
                 <w:color w:val="0D0D0D" w:themeColor="text1" w:themeTint="F2"/>
               </w:rPr>
-              <w:t>Реализовать fallback-сценарий: «информации нет, перевожу на администратора»</w:t>
+              <w:t xml:space="preserve">Реализовать </w:t>
+            </w:r>
+            <w:proofErr w:type="spellStart"/>
+            <w:r>
+              <w:rPr>
+                <w:i/>
+                <w:iCs/>
+                <w:color w:val="0D0D0D" w:themeColor="text1" w:themeTint="F2"/>
+              </w:rPr>
+              <w:t>fallback</w:t>
+            </w:r>
+            <w:proofErr w:type="spellEnd"/>
+            <w:r>
+              <w:rPr>
+                <w:i/>
+                <w:iCs/>
+                <w:color w:val="0D0D0D" w:themeColor="text1" w:themeTint="F2"/>
+              </w:rPr>
+              <w:t>-сценарий: «информации нет, перевожу на администратора»</w:t>
             </w:r>
           </w:p>
         </w:tc>
@@ -7274,7 +8135,25 @@
                 <w:iCs/>
                 <w:color w:val="0D0D0D" w:themeColor="text1" w:themeTint="F2"/>
               </w:rPr>
-              <w:t>Ограничить длину запросов, использовать кэширование, применять недорогие модели или локальные embedding-модели</w:t>
+              <w:t xml:space="preserve">Ограничить длину запросов, использовать кэширование, применять недорогие модели или локальные </w:t>
+            </w:r>
+            <w:proofErr w:type="spellStart"/>
+            <w:r>
+              <w:rPr>
+                <w:i/>
+                <w:iCs/>
+                <w:color w:val="0D0D0D" w:themeColor="text1" w:themeTint="F2"/>
+              </w:rPr>
+              <w:t>embedding</w:t>
+            </w:r>
+            <w:proofErr w:type="spellEnd"/>
+            <w:r>
+              <w:rPr>
+                <w:i/>
+                <w:iCs/>
+                <w:color w:val="0D0D0D" w:themeColor="text1" w:themeTint="F2"/>
+              </w:rPr>
+              <w:t>-модели</w:t>
             </w:r>
           </w:p>
         </w:tc>
@@ -7796,7 +8675,6 @@
                 <w:sz w:val="20"/>
                 <w:szCs w:val="20"/>
               </w:rPr>
-              <w:lastRenderedPageBreak/>
               <w:t>2. Проектирование</w:t>
             </w:r>
           </w:p>
@@ -7936,25 +8814,7 @@
                 <w:sz w:val="20"/>
                 <w:szCs w:val="20"/>
               </w:rPr>
-              <w:t>3</w:t>
-            </w:r>
-            <w:r>
-              <w:rPr>
-                <w:b/>
-                <w:bCs/>
-                <w:sz w:val="20"/>
-                <w:szCs w:val="20"/>
-              </w:rPr>
-              <w:t>. Разработка</w:t>
-            </w:r>
-            <w:r>
-              <w:rPr>
-                <w:b/>
-                <w:bCs/>
-                <w:sz w:val="20"/>
-                <w:szCs w:val="20"/>
-              </w:rPr>
-              <w:t xml:space="preserve"> </w:t>
+              <w:t xml:space="preserve">3. Разработка </w:t>
             </w:r>
             <w:r>
               <w:rPr>
@@ -7992,7 +8852,25 @@
                 <w:sz w:val="20"/>
                 <w:szCs w:val="20"/>
               </w:rPr>
-              <w:t>Разбиение документов на фрагменты, создание embeddings, настройка поиска, генерация ответов</w:t>
+              <w:t xml:space="preserve">Разбиение документов на фрагменты, создание </w:t>
+            </w:r>
+            <w:proofErr w:type="spellStart"/>
+            <w:r>
+              <w:rPr>
+                <w:color w:val="666666"/>
+                <w:sz w:val="20"/>
+                <w:szCs w:val="20"/>
+              </w:rPr>
+              <w:t>embeddings</w:t>
+            </w:r>
+            <w:proofErr w:type="spellEnd"/>
+            <w:r>
+              <w:rPr>
+                <w:color w:val="666666"/>
+                <w:sz w:val="20"/>
+                <w:szCs w:val="20"/>
+              </w:rPr>
+              <w:t>, настройка поиска, генерация ответов</w:t>
             </w:r>
           </w:p>
         </w:tc>
@@ -8123,8 +9001,36 @@
                 <w:sz w:val="20"/>
                 <w:szCs w:val="20"/>
               </w:rPr>
-              <w:t>Создание Telegram-бота или веб-чата, подключение backend</w:t>
-            </w:r>
+              <w:t xml:space="preserve">Создание </w:t>
+            </w:r>
+            <w:proofErr w:type="spellStart"/>
+            <w:r>
+              <w:rPr>
+                <w:color w:val="666666"/>
+                <w:sz w:val="20"/>
+                <w:szCs w:val="20"/>
+              </w:rPr>
+              <w:t>Telegram</w:t>
+            </w:r>
+            <w:proofErr w:type="spellEnd"/>
+            <w:r>
+              <w:rPr>
+                <w:color w:val="666666"/>
+                <w:sz w:val="20"/>
+                <w:szCs w:val="20"/>
+              </w:rPr>
+              <w:t xml:space="preserve">-бота или веб-чата, подключение </w:t>
+            </w:r>
+            <w:proofErr w:type="spellStart"/>
+            <w:r>
+              <w:rPr>
+                <w:color w:val="666666"/>
+                <w:sz w:val="20"/>
+                <w:szCs w:val="20"/>
+              </w:rPr>
+              <w:t>backend</w:t>
+            </w:r>
+            <w:proofErr w:type="spellEnd"/>
           </w:p>
         </w:tc>
         <w:tc>
@@ -8700,6 +9606,7 @@
           <w:sz w:val="24"/>
           <w:szCs w:val="24"/>
         </w:rPr>
+        <w:lastRenderedPageBreak/>
         <w:t>☑</w:t>
       </w:r>
       <w:r>
@@ -8735,7 +9642,23 @@
           <w:sz w:val="24"/>
           <w:szCs w:val="24"/>
         </w:rPr>
-        <w:t xml:space="preserve"> Реализован интерфейс Telegram-бота или веб-чата.</w:t>
+        <w:t xml:space="preserve"> Реализован интерфейс </w:t>
+      </w:r>
+      <w:proofErr w:type="spellStart"/>
+      <w:r>
+        <w:rPr>
+          <w:sz w:val="24"/>
+          <w:szCs w:val="24"/>
+        </w:rPr>
+        <w:t>Telegram</w:t>
+      </w:r>
+      <w:proofErr w:type="spellEnd"/>
+      <w:r>
+        <w:rPr>
+          <w:sz w:val="24"/>
+          <w:szCs w:val="24"/>
+        </w:rPr>
+        <w:t>-бота или веб-чата.</w:t>
       </w:r>
     </w:p>
     <w:p>
@@ -8812,7 +9735,6 @@
           <w:sz w:val="24"/>
           <w:szCs w:val="24"/>
         </w:rPr>
-        <w:lastRenderedPageBreak/>
         <w:t>☑</w:t>
       </w:r>
       <w:r>
@@ -9021,8 +9943,21 @@
               <w:spacing w:after="200"/>
             </w:pPr>
             <w:r>
-              <w:t>Эсмарх Круж Клизмович</w:t>
-            </w:r>
+              <w:t xml:space="preserve">Эсмарх </w:t>
+            </w:r>
+            <w:proofErr w:type="spellStart"/>
+            <w:r>
+              <w:t>Круж</w:t>
+            </w:r>
+            <w:proofErr w:type="spellEnd"/>
+            <w:r>
+              <w:t xml:space="preserve"> </w:t>
+            </w:r>
+            <w:proofErr w:type="spellStart"/>
+            <w:r>
+              <w:t>Клизмович</w:t>
+            </w:r>
+            <w:proofErr w:type="spellEnd"/>
           </w:p>
         </w:tc>
         <w:tc>
@@ -9093,8 +10028,13 @@
             <w:pPr>
               <w:spacing w:after="200"/>
             </w:pPr>
-            <w:r>
-              <w:t>Петлин Дмитрий Витальевич</w:t>
+            <w:proofErr w:type="spellStart"/>
+            <w:r>
+              <w:t>Петлин</w:t>
+            </w:r>
+            <w:proofErr w:type="spellEnd"/>
+            <w:r>
+              <w:t xml:space="preserve"> Дмитрий Витальевич</w:t>
             </w:r>
           </w:p>
         </w:tc>
@@ -9166,9 +10106,19 @@
             <w:pPr>
               <w:spacing w:after="200"/>
             </w:pPr>
-            <w:r>
-              <w:t>Скопова Трубка Фонендовна</w:t>
-            </w:r>
+            <w:proofErr w:type="spellStart"/>
+            <w:r>
+              <w:t>Скопова</w:t>
+            </w:r>
+            <w:proofErr w:type="spellEnd"/>
+            <w:r>
+              <w:t xml:space="preserve"> Трубка </w:t>
+            </w:r>
+            <w:proofErr w:type="spellStart"/>
+            <w:r>
+              <w:t>Фонендовна</w:t>
+            </w:r>
+            <w:proofErr w:type="spellEnd"/>
           </w:p>
         </w:tc>
         <w:tc>

</xml_diff>

<commit_message>
Add graduation deliverables: cost estimate, presentation, and TZ status.
Document project compliance, annual budget (costs.md), defense pptx, and link TZ_STATUS in README/stek.

Co-authored-by: Cursor <cursoragent@cursor.com>
</commit_message>
<xml_diff>
--- a/Техническое задание.docx
+++ b/Техническое задание.docx
@@ -422,23 +422,13 @@
                 <w:color w:val="0D0D0D" w:themeColor="text1" w:themeTint="F2"/>
               </w:rPr>
             </w:pPr>
-            <w:proofErr w:type="spellStart"/>
-            <w:r>
-              <w:rPr>
-                <w:i/>
-                <w:iCs/>
-                <w:color w:val="0D0D0D" w:themeColor="text1" w:themeTint="F2"/>
-              </w:rPr>
-              <w:t>Петлин</w:t>
-            </w:r>
-            <w:proofErr w:type="spellEnd"/>
-            <w:r>
-              <w:rPr>
-                <w:i/>
-                <w:iCs/>
-                <w:color w:val="0D0D0D" w:themeColor="text1" w:themeTint="F2"/>
-              </w:rPr>
-              <w:t xml:space="preserve"> Дмитрий Витальевич</w:t>
+            <w:r>
+              <w:rPr>
+                <w:i/>
+                <w:iCs/>
+                <w:color w:val="0D0D0D" w:themeColor="text1" w:themeTint="F2"/>
+              </w:rPr>
+              <w:t>Петлин Дмитрий Витальевич</w:t>
             </w:r>
           </w:p>
         </w:tc>
@@ -1744,47 +1734,7 @@
           <w:sz w:val="24"/>
           <w:szCs w:val="24"/>
         </w:rPr>
-        <w:t>3.2 Пользовательские сценарии (</w:t>
-      </w:r>
-      <w:proofErr w:type="spellStart"/>
-      <w:r>
-        <w:rPr>
-          <w:b/>
-          <w:bCs/>
-          <w:sz w:val="24"/>
-          <w:szCs w:val="24"/>
-        </w:rPr>
-        <w:t>Use</w:t>
-      </w:r>
-      <w:proofErr w:type="spellEnd"/>
-      <w:r>
-        <w:rPr>
-          <w:b/>
-          <w:bCs/>
-          <w:sz w:val="24"/>
-          <w:szCs w:val="24"/>
-        </w:rPr>
-        <w:t xml:space="preserve"> </w:t>
-      </w:r>
-      <w:proofErr w:type="spellStart"/>
-      <w:r>
-        <w:rPr>
-          <w:b/>
-          <w:bCs/>
-          <w:sz w:val="24"/>
-          <w:szCs w:val="24"/>
-        </w:rPr>
-        <w:t>Cases</w:t>
-      </w:r>
-      <w:proofErr w:type="spellEnd"/>
-      <w:r>
-        <w:rPr>
-          <w:b/>
-          <w:bCs/>
-          <w:sz w:val="24"/>
-          <w:szCs w:val="24"/>
-        </w:rPr>
-        <w:t>)</w:t>
+        <w:t>3.2 Пользовательские сценарии (Use Cases)</w:t>
       </w:r>
     </w:p>
     <w:p>
@@ -2015,21 +1965,7 @@
                 <w:color w:val="0D0D0D" w:themeColor="text1" w:themeTint="F2"/>
               </w:rPr>
               <w:br/>
-              <w:t xml:space="preserve">Ожидаемый результат: Ассистент сообщает доступные способы записи: телефон, сайт, </w:t>
-            </w:r>
-            <w:proofErr w:type="spellStart"/>
-            <w:r>
-              <w:rPr>
-                <w:color w:val="0D0D0D" w:themeColor="text1" w:themeTint="F2"/>
-              </w:rPr>
-              <w:t>Telegram</w:t>
-            </w:r>
-            <w:proofErr w:type="spellEnd"/>
-            <w:r>
-              <w:rPr>
-                <w:color w:val="0D0D0D" w:themeColor="text1" w:themeTint="F2"/>
-              </w:rPr>
-              <w:t>-бот, онлайн-чат или обращение к администратору. Если реализована интеграция с системой записи, ассистент может предложить перейти к записи.</w:t>
+              <w:t>Ожидаемый результат: Ассистент сообщает доступные способы записи: телефон, сайт, Telegram-бот, онлайн-чат или обращение к администратору. Если реализована интеграция с системой записи, ассистент может предложить перейти к записи.</w:t>
             </w:r>
           </w:p>
           <w:p>
@@ -2295,35 +2231,7 @@
                 <w:sz w:val="20"/>
                 <w:szCs w:val="20"/>
               </w:rPr>
-              <w:t xml:space="preserve">Название: Запрос остатка отпуска. Пользователь: Сотрудник. Триггер: «Сколько дней отпуска у меня </w:t>
-            </w:r>
-            <w:proofErr w:type="spellStart"/>
-            <w:r>
-              <w:rPr>
-                <w:color w:val="047857"/>
-                <w:sz w:val="20"/>
-                <w:szCs w:val="20"/>
-              </w:rPr>
-              <w:t>осталось</w:t>
-            </w:r>
-            <w:proofErr w:type="gramStart"/>
-            <w:r>
-              <w:rPr>
-                <w:color w:val="047857"/>
-                <w:sz w:val="20"/>
-                <w:szCs w:val="20"/>
-              </w:rPr>
-              <w:t>?»Результат</w:t>
-            </w:r>
-            <w:proofErr w:type="spellEnd"/>
-            <w:proofErr w:type="gramEnd"/>
-            <w:r>
-              <w:rPr>
-                <w:color w:val="047857"/>
-                <w:sz w:val="20"/>
-                <w:szCs w:val="20"/>
-              </w:rPr>
-              <w:t>: Ассистент показывает остаток дней и ссылку на заявку</w:t>
+              <w:t>Название: Запрос остатка отпуска. Пользователь: Сотрудник. Триггер: «Сколько дней отпуска у меня осталось?»Результат: Ассистент показывает остаток дней и ссылку на заявку</w:t>
             </w:r>
           </w:p>
         </w:tc>
@@ -2349,47 +2257,7 @@
           <w:sz w:val="24"/>
           <w:szCs w:val="24"/>
         </w:rPr>
-        <w:t>4.1 Основные функции (</w:t>
-      </w:r>
-      <w:proofErr w:type="spellStart"/>
-      <w:r>
-        <w:rPr>
-          <w:b/>
-          <w:bCs/>
-          <w:sz w:val="24"/>
-          <w:szCs w:val="24"/>
-        </w:rPr>
-        <w:t>Must</w:t>
-      </w:r>
-      <w:proofErr w:type="spellEnd"/>
-      <w:r>
-        <w:rPr>
-          <w:b/>
-          <w:bCs/>
-          <w:sz w:val="24"/>
-          <w:szCs w:val="24"/>
-        </w:rPr>
-        <w:t xml:space="preserve"> </w:t>
-      </w:r>
-      <w:proofErr w:type="spellStart"/>
-      <w:r>
-        <w:rPr>
-          <w:b/>
-          <w:bCs/>
-          <w:sz w:val="24"/>
-          <w:szCs w:val="24"/>
-        </w:rPr>
-        <w:t>Have</w:t>
-      </w:r>
-      <w:proofErr w:type="spellEnd"/>
-      <w:r>
-        <w:rPr>
-          <w:b/>
-          <w:bCs/>
-          <w:sz w:val="24"/>
-          <w:szCs w:val="24"/>
-        </w:rPr>
-        <w:t>)</w:t>
+        <w:t>4.1 Основные функции (Must Have)</w:t>
       </w:r>
     </w:p>
     <w:p>
@@ -2695,25 +2563,7 @@
                 <w:color w:val="0D0D0D" w:themeColor="text1" w:themeTint="F2"/>
               </w:rPr>
               <w:br/>
-              <w:t xml:space="preserve">Ассистент должен быть доступен через </w:t>
-            </w:r>
-            <w:proofErr w:type="spellStart"/>
-            <w:r>
-              <w:rPr>
-                <w:i/>
-                <w:iCs/>
-                <w:color w:val="0D0D0D" w:themeColor="text1" w:themeTint="F2"/>
-              </w:rPr>
-              <w:t>Telegram</w:t>
-            </w:r>
-            <w:proofErr w:type="spellEnd"/>
-            <w:r>
-              <w:rPr>
-                <w:i/>
-                <w:iCs/>
-                <w:color w:val="0D0D0D" w:themeColor="text1" w:themeTint="F2"/>
-              </w:rPr>
-              <w:t>-бота или веб-чат.</w:t>
+              <w:t>Ассистент должен быть доступен через Telegram-бота или веб-чат.</w:t>
             </w:r>
             <w:r>
               <w:rPr>
@@ -2835,47 +2685,7 @@
           <w:sz w:val="24"/>
           <w:szCs w:val="24"/>
         </w:rPr>
-        <w:t>4.2 Желательные функции (</w:t>
-      </w:r>
-      <w:proofErr w:type="spellStart"/>
-      <w:r>
-        <w:rPr>
-          <w:b/>
-          <w:bCs/>
-          <w:sz w:val="24"/>
-          <w:szCs w:val="24"/>
-        </w:rPr>
-        <w:t>Should</w:t>
-      </w:r>
-      <w:proofErr w:type="spellEnd"/>
-      <w:r>
-        <w:rPr>
-          <w:b/>
-          <w:bCs/>
-          <w:sz w:val="24"/>
-          <w:szCs w:val="24"/>
-        </w:rPr>
-        <w:t xml:space="preserve"> </w:t>
-      </w:r>
-      <w:proofErr w:type="spellStart"/>
-      <w:r>
-        <w:rPr>
-          <w:b/>
-          <w:bCs/>
-          <w:sz w:val="24"/>
-          <w:szCs w:val="24"/>
-        </w:rPr>
-        <w:t>Have</w:t>
-      </w:r>
-      <w:proofErr w:type="spellEnd"/>
-      <w:r>
-        <w:rPr>
-          <w:b/>
-          <w:bCs/>
-          <w:sz w:val="24"/>
-          <w:szCs w:val="24"/>
-        </w:rPr>
-        <w:t>)</w:t>
+        <w:t>4.2 Желательные функции (Should Have)</w:t>
       </w:r>
     </w:p>
     <w:p>
@@ -3211,47 +3021,7 @@
           <w:sz w:val="24"/>
           <w:szCs w:val="24"/>
         </w:rPr>
-        <w:t>4.3 Возможные функции (</w:t>
-      </w:r>
-      <w:proofErr w:type="spellStart"/>
-      <w:r>
-        <w:rPr>
-          <w:b/>
-          <w:bCs/>
-          <w:sz w:val="24"/>
-          <w:szCs w:val="24"/>
-        </w:rPr>
-        <w:t>Could</w:t>
-      </w:r>
-      <w:proofErr w:type="spellEnd"/>
-      <w:r>
-        <w:rPr>
-          <w:b/>
-          <w:bCs/>
-          <w:sz w:val="24"/>
-          <w:szCs w:val="24"/>
-        </w:rPr>
-        <w:t xml:space="preserve"> </w:t>
-      </w:r>
-      <w:proofErr w:type="spellStart"/>
-      <w:r>
-        <w:rPr>
-          <w:b/>
-          <w:bCs/>
-          <w:sz w:val="24"/>
-          <w:szCs w:val="24"/>
-        </w:rPr>
-        <w:t>Have</w:t>
-      </w:r>
-      <w:proofErr w:type="spellEnd"/>
-      <w:r>
-        <w:rPr>
-          <w:b/>
-          <w:bCs/>
-          <w:sz w:val="24"/>
-          <w:szCs w:val="24"/>
-        </w:rPr>
-        <w:t>)</w:t>
+        <w:t>4.3 Возможные функции (Could Have)</w:t>
       </w:r>
     </w:p>
     <w:p>
@@ -3532,7 +3302,6 @@
                 <w:color w:val="0D0D0D" w:themeColor="text1" w:themeTint="F2"/>
               </w:rPr>
             </w:pPr>
-            <w:proofErr w:type="spellStart"/>
             <w:r>
               <w:rPr>
                 <w:b/>
@@ -3543,7 +3312,6 @@
               </w:rPr>
               <w:t>Мультиязычность</w:t>
             </w:r>
-            <w:proofErr w:type="spellEnd"/>
           </w:p>
           <w:p>
             <w:pPr>
@@ -3625,47 +3393,7 @@
           <w:sz w:val="24"/>
           <w:szCs w:val="24"/>
         </w:rPr>
-        <w:t>4.4 Исключения (</w:t>
-      </w:r>
-      <w:proofErr w:type="spellStart"/>
-      <w:r>
-        <w:rPr>
-          <w:b/>
-          <w:bCs/>
-          <w:sz w:val="24"/>
-          <w:szCs w:val="24"/>
-        </w:rPr>
-        <w:t>Won't</w:t>
-      </w:r>
-      <w:proofErr w:type="spellEnd"/>
-      <w:r>
-        <w:rPr>
-          <w:b/>
-          <w:bCs/>
-          <w:sz w:val="24"/>
-          <w:szCs w:val="24"/>
-        </w:rPr>
-        <w:t xml:space="preserve"> </w:t>
-      </w:r>
-      <w:proofErr w:type="spellStart"/>
-      <w:r>
-        <w:rPr>
-          <w:b/>
-          <w:bCs/>
-          <w:sz w:val="24"/>
-          <w:szCs w:val="24"/>
-        </w:rPr>
-        <w:t>Have</w:t>
-      </w:r>
-      <w:proofErr w:type="spellEnd"/>
-      <w:r>
-        <w:rPr>
-          <w:b/>
-          <w:bCs/>
-          <w:sz w:val="24"/>
-          <w:szCs w:val="24"/>
-        </w:rPr>
-        <w:t>)</w:t>
+        <w:t>4.4 Исключения (Won't Have)</w:t>
       </w:r>
     </w:p>
     <w:p>
@@ -3680,29 +3408,7 @@
           <w:sz w:val="18"/>
           <w:szCs w:val="18"/>
         </w:rPr>
-        <w:t xml:space="preserve">Что точно НЕ входит в </w:t>
-      </w:r>
-      <w:proofErr w:type="spellStart"/>
-      <w:r>
-        <w:rPr>
-          <w:i/>
-          <w:iCs/>
-          <w:color w:val="666666"/>
-          <w:sz w:val="18"/>
-          <w:szCs w:val="18"/>
-        </w:rPr>
-        <w:t>scope</w:t>
-      </w:r>
-      <w:proofErr w:type="spellEnd"/>
-      <w:r>
-        <w:rPr>
-          <w:i/>
-          <w:iCs/>
-          <w:color w:val="666666"/>
-          <w:sz w:val="18"/>
-          <w:szCs w:val="18"/>
-        </w:rPr>
-        <w:t xml:space="preserve"> проекта</w:t>
+        <w:t>Что точно НЕ входит в scope проекта</w:t>
       </w:r>
     </w:p>
     <w:tbl>
@@ -4162,13 +3868,8 @@
               </w:rPr>
             </w:pPr>
             <w:r>
-              <w:t xml:space="preserve">PDF / DOCX / TXT / </w:t>
-            </w:r>
-            <w:proofErr w:type="spellStart"/>
-            <w:r>
-              <w:t>Markdown</w:t>
-            </w:r>
-            <w:proofErr w:type="spellEnd"/>
+              <w:t>PDF / DOCX / TXT / Markdown</w:t>
+            </w:r>
           </w:p>
         </w:tc>
         <w:tc>
@@ -4380,13 +4081,8 @@
           </w:tcPr>
           <w:p>
             <w:r>
-              <w:t xml:space="preserve">TXT / CSV / </w:t>
-            </w:r>
-            <w:proofErr w:type="spellStart"/>
-            <w:r>
-              <w:t>Markdown</w:t>
-            </w:r>
-            <w:proofErr w:type="spellEnd"/>
+              <w:t>TXT / CSV / Markdown</w:t>
+            </w:r>
           </w:p>
         </w:tc>
         <w:tc>
@@ -4479,15 +4175,7 @@
           </w:tcPr>
           <w:p>
             <w:r>
-              <w:t xml:space="preserve">CSV / Google </w:t>
-            </w:r>
-            <w:proofErr w:type="spellStart"/>
-            <w:r>
-              <w:t>Sheets</w:t>
-            </w:r>
-            <w:proofErr w:type="spellEnd"/>
-            <w:r>
-              <w:t xml:space="preserve"> / TXT</w:t>
+              <w:t>CSV / Google Sheets / TXT</w:t>
             </w:r>
           </w:p>
         </w:tc>
@@ -4691,13 +4379,8 @@
           </w:tcPr>
           <w:p>
             <w:r>
-              <w:t xml:space="preserve">DOCX / TXT / </w:t>
-            </w:r>
-            <w:proofErr w:type="spellStart"/>
-            <w:r>
-              <w:t>Markdown</w:t>
-            </w:r>
-            <w:proofErr w:type="spellEnd"/>
+              <w:t>DOCX / TXT / Markdown</w:t>
+            </w:r>
           </w:p>
         </w:tc>
         <w:tc>
@@ -5227,23 +4910,13 @@
                 <w:color w:val="0D0D0D" w:themeColor="text1" w:themeTint="F2"/>
               </w:rPr>
             </w:pPr>
-            <w:proofErr w:type="spellStart"/>
-            <w:r>
-              <w:rPr>
-                <w:i/>
-                <w:iCs/>
-                <w:color w:val="0D0D0D" w:themeColor="text1" w:themeTint="F2"/>
-              </w:rPr>
-              <w:t>Telegram</w:t>
-            </w:r>
-            <w:proofErr w:type="spellEnd"/>
-            <w:r>
-              <w:rPr>
-                <w:i/>
-                <w:iCs/>
-                <w:color w:val="0D0D0D" w:themeColor="text1" w:themeTint="F2"/>
-              </w:rPr>
-              <w:t>-бот и/или веб-чат</w:t>
+            <w:r>
+              <w:rPr>
+                <w:i/>
+                <w:iCs/>
+                <w:color w:val="0D0D0D" w:themeColor="text1" w:themeTint="F2"/>
+              </w:rPr>
+              <w:t>Telegram-бот и/или веб-чат</w:t>
             </w:r>
           </w:p>
         </w:tc>
@@ -5507,7 +5180,6 @@
                 <w:lang w:val="en-US"/>
               </w:rPr>
             </w:pPr>
-            <w:proofErr w:type="gramStart"/>
             <w:r>
               <w:rPr>
                 <w:i/>
@@ -5524,9 +5196,16 @@
                 <w:color w:val="0D0D0D" w:themeColor="text1" w:themeTint="F2"/>
                 <w:lang w:val="en-US"/>
               </w:rPr>
-              <w:t> gpt</w:t>
-            </w:r>
-            <w:proofErr w:type="gramEnd"/>
+              <w:t> gpt-</w:t>
+            </w:r>
+            <w:r>
+              <w:rPr>
+                <w:i/>
+                <w:iCs/>
+                <w:color w:val="0D0D0D" w:themeColor="text1" w:themeTint="F2"/>
+              </w:rPr>
+              <w:t>5.</w:t>
+            </w:r>
             <w:r>
               <w:rPr>
                 <w:i/>
@@ -5534,7 +5213,7 @@
                 <w:color w:val="0D0D0D" w:themeColor="text1" w:themeTint="F2"/>
                 <w:lang w:val="en-US"/>
               </w:rPr>
-              <w:t xml:space="preserve">-4o-nano (-mini) </w:t>
+              <w:t xml:space="preserve">4-nano (-mini) </w:t>
             </w:r>
             <w:r>
               <w:rPr>
@@ -5543,27 +5222,7 @@
                 <w:color w:val="0D0D0D" w:themeColor="text1" w:themeTint="F2"/>
                 <w:lang w:val="en-US"/>
               </w:rPr>
-              <w:t xml:space="preserve">/ </w:t>
-            </w:r>
-            <w:proofErr w:type="spellStart"/>
-            <w:r>
-              <w:rPr>
-                <w:i/>
-                <w:iCs/>
-                <w:color w:val="0D0D0D" w:themeColor="text1" w:themeTint="F2"/>
-                <w:lang w:val="en-US"/>
-              </w:rPr>
-              <w:t>gigaChat</w:t>
-            </w:r>
-            <w:proofErr w:type="spellEnd"/>
-            <w:r>
-              <w:rPr>
-                <w:i/>
-                <w:iCs/>
-                <w:color w:val="0D0D0D" w:themeColor="text1" w:themeTint="F2"/>
-                <w:lang w:val="en-US"/>
-              </w:rPr>
-              <w:t xml:space="preserve"> </w:t>
+              <w:t xml:space="preserve">/ gigaChat </w:t>
             </w:r>
             <w:r>
               <w:rPr>
@@ -5675,7 +5334,6 @@
                 <w:color w:val="0D0D0D" w:themeColor="text1" w:themeTint="F2"/>
               </w:rPr>
             </w:pPr>
-            <w:proofErr w:type="spellStart"/>
             <w:r>
               <w:rPr>
                 <w:i/>
@@ -5684,7 +5342,6 @@
               </w:rPr>
               <w:t>Chroma</w:t>
             </w:r>
-            <w:proofErr w:type="spellEnd"/>
           </w:p>
         </w:tc>
       </w:tr>
@@ -5758,7 +5415,6 @@
                 <w:color w:val="0D0D0D" w:themeColor="text1" w:themeTint="F2"/>
               </w:rPr>
             </w:pPr>
-            <w:proofErr w:type="spellStart"/>
             <w:r>
               <w:rPr>
                 <w:i/>
@@ -5767,7 +5423,6 @@
               </w:rPr>
               <w:t>LangChain</w:t>
             </w:r>
-            <w:proofErr w:type="spellEnd"/>
           </w:p>
         </w:tc>
       </w:tr>
@@ -5796,7 +5451,6 @@
                 <w:color w:val="0D0D0D" w:themeColor="text1" w:themeTint="F2"/>
               </w:rPr>
             </w:pPr>
-            <w:proofErr w:type="spellStart"/>
             <w:r>
               <w:rPr>
                 <w:b/>
@@ -5806,7 +5460,6 @@
               <w:lastRenderedPageBreak/>
               <w:t>Эмбеддинги</w:t>
             </w:r>
-            <w:proofErr w:type="spellEnd"/>
           </w:p>
         </w:tc>
         <w:tc>
@@ -6039,7 +5692,6 @@
                 <w:color w:val="0D0D0D" w:themeColor="text1" w:themeTint="F2"/>
               </w:rPr>
             </w:pPr>
-            <w:proofErr w:type="spellStart"/>
             <w:r>
               <w:rPr>
                 <w:i/>
@@ -6049,7 +5701,6 @@
               </w:rPr>
               <w:t>SQLLite</w:t>
             </w:r>
-            <w:proofErr w:type="spellEnd"/>
           </w:p>
         </w:tc>
       </w:tr>
@@ -6079,7 +5730,6 @@
                 <w:lang w:val="en-US"/>
               </w:rPr>
             </w:pPr>
-            <w:proofErr w:type="spellStart"/>
             <w:r>
               <w:rPr>
                 <w:b/>
@@ -6088,7 +5738,6 @@
               </w:rPr>
               <w:t>Backend</w:t>
             </w:r>
-            <w:proofErr w:type="spellEnd"/>
             <w:r>
               <w:rPr>
                 <w:b/>
@@ -6131,18 +5780,8 @@
                 <w:iCs/>
                 <w:color w:val="0D0D0D" w:themeColor="text1" w:themeTint="F2"/>
               </w:rPr>
-              <w:t xml:space="preserve">Python, </w:t>
-            </w:r>
-            <w:proofErr w:type="spellStart"/>
-            <w:r>
-              <w:rPr>
-                <w:i/>
-                <w:iCs/>
-                <w:color w:val="0D0D0D" w:themeColor="text1" w:themeTint="F2"/>
-              </w:rPr>
-              <w:t>FastAPI</w:t>
-            </w:r>
-            <w:proofErr w:type="spellEnd"/>
+              <w:t>Python, FastAPI</w:t>
+            </w:r>
             <w:r>
               <w:rPr>
                 <w:i/>
@@ -6158,18 +5797,8 @@
                 <w:iCs/>
                 <w:color w:val="0D0D0D" w:themeColor="text1" w:themeTint="F2"/>
               </w:rPr>
-              <w:t xml:space="preserve"> </w:t>
-            </w:r>
-            <w:proofErr w:type="spellStart"/>
-            <w:r>
-              <w:rPr>
-                <w:i/>
-                <w:iCs/>
-                <w:color w:val="0D0D0D" w:themeColor="text1" w:themeTint="F2"/>
-              </w:rPr>
-              <w:t>Flask</w:t>
-            </w:r>
-            <w:proofErr w:type="spellEnd"/>
+              <w:t xml:space="preserve"> Flask</w:t>
+            </w:r>
           </w:p>
         </w:tc>
       </w:tr>
@@ -6310,41 +5939,13 @@
                 <w:color w:val="0D0D0D" w:themeColor="text1" w:themeTint="F2"/>
               </w:rPr>
             </w:pPr>
-            <w:proofErr w:type="spellStart"/>
-            <w:r>
-              <w:rPr>
-                <w:i/>
-                <w:iCs/>
-                <w:color w:val="0D0D0D" w:themeColor="text1" w:themeTint="F2"/>
-              </w:rPr>
-              <w:t>Telegram</w:t>
-            </w:r>
-            <w:proofErr w:type="spellEnd"/>
-            <w:r>
-              <w:rPr>
-                <w:i/>
-                <w:iCs/>
-                <w:color w:val="0D0D0D" w:themeColor="text1" w:themeTint="F2"/>
-              </w:rPr>
-              <w:t xml:space="preserve"> </w:t>
-            </w:r>
-            <w:proofErr w:type="spellStart"/>
-            <w:r>
-              <w:rPr>
-                <w:i/>
-                <w:iCs/>
-                <w:color w:val="0D0D0D" w:themeColor="text1" w:themeTint="F2"/>
-              </w:rPr>
-              <w:t>Bot</w:t>
-            </w:r>
-            <w:proofErr w:type="spellEnd"/>
-            <w:r>
-              <w:rPr>
-                <w:i/>
-                <w:iCs/>
-                <w:color w:val="0D0D0D" w:themeColor="text1" w:themeTint="F2"/>
-              </w:rPr>
-              <w:t xml:space="preserve"> API или веб-интерфейс</w:t>
+            <w:r>
+              <w:rPr>
+                <w:i/>
+                <w:iCs/>
+                <w:color w:val="0D0D0D" w:themeColor="text1" w:themeTint="F2"/>
+              </w:rPr>
+              <w:t>Telegram Bot API или веб-интерфейс</w:t>
             </w:r>
           </w:p>
         </w:tc>
@@ -6425,25 +6026,7 @@
                 <w:iCs/>
                 <w:color w:val="0D0D0D" w:themeColor="text1" w:themeTint="F2"/>
               </w:rPr>
-              <w:t xml:space="preserve">CRM, медицинская информационная система, Google </w:t>
-            </w:r>
-            <w:proofErr w:type="spellStart"/>
-            <w:r>
-              <w:rPr>
-                <w:i/>
-                <w:iCs/>
-                <w:color w:val="0D0D0D" w:themeColor="text1" w:themeTint="F2"/>
-              </w:rPr>
-              <w:t>Sheets</w:t>
-            </w:r>
-            <w:proofErr w:type="spellEnd"/>
-            <w:r>
-              <w:rPr>
-                <w:i/>
-                <w:iCs/>
-                <w:color w:val="0D0D0D" w:themeColor="text1" w:themeTint="F2"/>
-              </w:rPr>
-              <w:t>, календарь записи</w:t>
+              <w:t>CRM, медицинская информационная система, Google Sheets, календарь записи</w:t>
             </w:r>
           </w:p>
         </w:tc>
@@ -6965,25 +6548,7 @@
                 <w:color w:val="0D0D0D" w:themeColor="text1" w:themeTint="F2"/>
               </w:rPr>
               <w:lastRenderedPageBreak/>
-              <w:t xml:space="preserve">недорогими инструментами. Например, можно использовать локальную векторную базу FAISS или </w:t>
-            </w:r>
-            <w:proofErr w:type="spellStart"/>
-            <w:r>
-              <w:rPr>
-                <w:i/>
-                <w:iCs/>
-                <w:color w:val="0D0D0D" w:themeColor="text1" w:themeTint="F2"/>
-              </w:rPr>
-              <w:t>Chroma</w:t>
-            </w:r>
-            <w:proofErr w:type="spellEnd"/>
-            <w:r>
-              <w:rPr>
-                <w:i/>
-                <w:iCs/>
-                <w:color w:val="0D0D0D" w:themeColor="text1" w:themeTint="F2"/>
-              </w:rPr>
-              <w:t>.</w:t>
+              <w:t>недорогими инструментами. Например, можно использовать локальную векторную базу FAISS или Chroma.</w:t>
             </w:r>
           </w:p>
           <w:p>
@@ -7047,7 +6612,6 @@
                 <w:color w:val="0D0D0D" w:themeColor="text1" w:themeTint="F2"/>
               </w:rPr>
             </w:pPr>
-            <w:proofErr w:type="spellStart"/>
             <w:r>
               <w:rPr>
                 <w:i/>
@@ -7057,7 +6621,6 @@
               </w:rPr>
               <w:t>gpt</w:t>
             </w:r>
-            <w:proofErr w:type="spellEnd"/>
             <w:r>
               <w:rPr>
                 <w:i/>
@@ -7099,7 +6662,6 @@
               </w:rPr>
               <w:t xml:space="preserve"> </w:t>
             </w:r>
-            <w:proofErr w:type="spellStart"/>
             <w:r>
               <w:rPr>
                 <w:i/>
@@ -7109,7 +6671,6 @@
               </w:rPr>
               <w:t>gpt</w:t>
             </w:r>
-            <w:proofErr w:type="spellEnd"/>
             <w:r>
               <w:rPr>
                 <w:i/>
@@ -7141,16 +6702,7 @@
                 <w:iCs/>
                 <w:color w:val="0D0D0D" w:themeColor="text1" w:themeTint="F2"/>
               </w:rPr>
-              <w:t xml:space="preserve">настраивается </w:t>
-            </w:r>
-            <w:proofErr w:type="gramStart"/>
-            <w:r>
-              <w:rPr>
-                <w:i/>
-                <w:iCs/>
-                <w:color w:val="0D0D0D" w:themeColor="text1" w:themeTint="F2"/>
-              </w:rPr>
-              <w:t xml:space="preserve">в </w:t>
+              <w:t xml:space="preserve">настраивается в </w:t>
             </w:r>
             <w:r>
               <w:rPr>
@@ -7169,7 +6721,6 @@
               </w:rPr>
               <w:t>env</w:t>
             </w:r>
-            <w:proofErr w:type="gramEnd"/>
             <w:r>
               <w:rPr>
                 <w:i/>
@@ -7490,19 +7041,8 @@
           <w:sz w:val="24"/>
           <w:szCs w:val="24"/>
         </w:rPr>
-        <w:t xml:space="preserve">7.2 Риски и </w:t>
+        <w:t>7.2 Риски и митигация</w:t>
       </w:r>
-      <w:proofErr w:type="spellStart"/>
-      <w:r>
-        <w:rPr>
-          <w:b/>
-          <w:bCs/>
-          <w:sz w:val="24"/>
-          <w:szCs w:val="24"/>
-        </w:rPr>
-        <w:t>митигация</w:t>
-      </w:r>
-      <w:proofErr w:type="spellEnd"/>
     </w:p>
     <w:tbl>
       <w:tblPr>
@@ -7598,7 +7138,6 @@
             </w:tcMar>
           </w:tcPr>
           <w:p>
-            <w:proofErr w:type="spellStart"/>
             <w:r>
               <w:rPr>
                 <w:b/>
@@ -7606,7 +7145,6 @@
               </w:rPr>
               <w:t>Митигация</w:t>
             </w:r>
-            <w:proofErr w:type="spellEnd"/>
           </w:p>
         </w:tc>
       </w:tr>
@@ -8011,25 +7549,7 @@
                 <w:iCs/>
                 <w:color w:val="0D0D0D" w:themeColor="text1" w:themeTint="F2"/>
               </w:rPr>
-              <w:t xml:space="preserve">Реализовать </w:t>
-            </w:r>
-            <w:proofErr w:type="spellStart"/>
-            <w:r>
-              <w:rPr>
-                <w:i/>
-                <w:iCs/>
-                <w:color w:val="0D0D0D" w:themeColor="text1" w:themeTint="F2"/>
-              </w:rPr>
-              <w:t>fallback</w:t>
-            </w:r>
-            <w:proofErr w:type="spellEnd"/>
-            <w:r>
-              <w:rPr>
-                <w:i/>
-                <w:iCs/>
-                <w:color w:val="0D0D0D" w:themeColor="text1" w:themeTint="F2"/>
-              </w:rPr>
-              <w:t>-сценарий: «информации нет, перевожу на администратора»</w:t>
+              <w:t>Реализовать fallback-сценарий: «информации нет, перевожу на администратора»</w:t>
             </w:r>
           </w:p>
         </w:tc>
@@ -8135,25 +7655,7 @@
                 <w:iCs/>
                 <w:color w:val="0D0D0D" w:themeColor="text1" w:themeTint="F2"/>
               </w:rPr>
-              <w:t xml:space="preserve">Ограничить длину запросов, использовать кэширование, применять недорогие модели или локальные </w:t>
-            </w:r>
-            <w:proofErr w:type="spellStart"/>
-            <w:r>
-              <w:rPr>
-                <w:i/>
-                <w:iCs/>
-                <w:color w:val="0D0D0D" w:themeColor="text1" w:themeTint="F2"/>
-              </w:rPr>
-              <w:t>embedding</w:t>
-            </w:r>
-            <w:proofErr w:type="spellEnd"/>
-            <w:r>
-              <w:rPr>
-                <w:i/>
-                <w:iCs/>
-                <w:color w:val="0D0D0D" w:themeColor="text1" w:themeTint="F2"/>
-              </w:rPr>
-              <w:t>-модели</w:t>
+              <w:t>Ограничить длину запросов, использовать кэширование, применять недорогие модели или локальные embedding-модели</w:t>
             </w:r>
           </w:p>
         </w:tc>
@@ -8852,25 +8354,7 @@
                 <w:sz w:val="20"/>
                 <w:szCs w:val="20"/>
               </w:rPr>
-              <w:t xml:space="preserve">Разбиение документов на фрагменты, создание </w:t>
-            </w:r>
-            <w:proofErr w:type="spellStart"/>
-            <w:r>
-              <w:rPr>
-                <w:color w:val="666666"/>
-                <w:sz w:val="20"/>
-                <w:szCs w:val="20"/>
-              </w:rPr>
-              <w:t>embeddings</w:t>
-            </w:r>
-            <w:proofErr w:type="spellEnd"/>
-            <w:r>
-              <w:rPr>
-                <w:color w:val="666666"/>
-                <w:sz w:val="20"/>
-                <w:szCs w:val="20"/>
-              </w:rPr>
-              <w:t>, настройка поиска, генерация ответов</w:t>
+              <w:t>Разбиение документов на фрагменты, создание embeddings, настройка поиска, генерация ответов</w:t>
             </w:r>
           </w:p>
         </w:tc>
@@ -9001,36 +8485,8 @@
                 <w:sz w:val="20"/>
                 <w:szCs w:val="20"/>
               </w:rPr>
-              <w:t xml:space="preserve">Создание </w:t>
-            </w:r>
-            <w:proofErr w:type="spellStart"/>
-            <w:r>
-              <w:rPr>
-                <w:color w:val="666666"/>
-                <w:sz w:val="20"/>
-                <w:szCs w:val="20"/>
-              </w:rPr>
-              <w:t>Telegram</w:t>
-            </w:r>
-            <w:proofErr w:type="spellEnd"/>
-            <w:r>
-              <w:rPr>
-                <w:color w:val="666666"/>
-                <w:sz w:val="20"/>
-                <w:szCs w:val="20"/>
-              </w:rPr>
-              <w:t xml:space="preserve">-бота или веб-чата, подключение </w:t>
-            </w:r>
-            <w:proofErr w:type="spellStart"/>
-            <w:r>
-              <w:rPr>
-                <w:color w:val="666666"/>
-                <w:sz w:val="20"/>
-                <w:szCs w:val="20"/>
-              </w:rPr>
-              <w:t>backend</w:t>
-            </w:r>
-            <w:proofErr w:type="spellEnd"/>
+              <w:t>Создание Telegram-бота или веб-чата, подключение backend</w:t>
+            </w:r>
           </w:p>
         </w:tc>
         <w:tc>
@@ -9642,23 +9098,7 @@
           <w:sz w:val="24"/>
           <w:szCs w:val="24"/>
         </w:rPr>
-        <w:t xml:space="preserve"> Реализован интерфейс </w:t>
-      </w:r>
-      <w:proofErr w:type="spellStart"/>
-      <w:r>
-        <w:rPr>
-          <w:sz w:val="24"/>
-          <w:szCs w:val="24"/>
-        </w:rPr>
-        <w:t>Telegram</w:t>
-      </w:r>
-      <w:proofErr w:type="spellEnd"/>
-      <w:r>
-        <w:rPr>
-          <w:sz w:val="24"/>
-          <w:szCs w:val="24"/>
-        </w:rPr>
-        <w:t>-бота или веб-чата.</w:t>
+        <w:t xml:space="preserve"> Реализован интерфейс Telegram-бота или веб-чата.</w:t>
       </w:r>
     </w:p>
     <w:p>
@@ -9943,21 +9383,8 @@
               <w:spacing w:after="200"/>
             </w:pPr>
             <w:r>
-              <w:t xml:space="preserve">Эсмарх </w:t>
-            </w:r>
-            <w:proofErr w:type="spellStart"/>
-            <w:r>
-              <w:t>Круж</w:t>
-            </w:r>
-            <w:proofErr w:type="spellEnd"/>
-            <w:r>
-              <w:t xml:space="preserve"> </w:t>
-            </w:r>
-            <w:proofErr w:type="spellStart"/>
-            <w:r>
-              <w:t>Клизмович</w:t>
-            </w:r>
-            <w:proofErr w:type="spellEnd"/>
+              <w:t>Эсмарх Круж Клизмович</w:t>
+            </w:r>
           </w:p>
         </w:tc>
         <w:tc>
@@ -10028,13 +9455,8 @@
             <w:pPr>
               <w:spacing w:after="200"/>
             </w:pPr>
-            <w:proofErr w:type="spellStart"/>
-            <w:r>
-              <w:t>Петлин</w:t>
-            </w:r>
-            <w:proofErr w:type="spellEnd"/>
-            <w:r>
-              <w:t xml:space="preserve"> Дмитрий Витальевич</w:t>
+            <w:r>
+              <w:t>Петлин Дмитрий Витальевич</w:t>
             </w:r>
           </w:p>
         </w:tc>
@@ -10106,19 +9528,9 @@
             <w:pPr>
               <w:spacing w:after="200"/>
             </w:pPr>
-            <w:proofErr w:type="spellStart"/>
-            <w:r>
-              <w:t>Скопова</w:t>
-            </w:r>
-            <w:proofErr w:type="spellEnd"/>
-            <w:r>
-              <w:t xml:space="preserve"> Трубка </w:t>
-            </w:r>
-            <w:proofErr w:type="spellStart"/>
-            <w:r>
-              <w:t>Фонендовна</w:t>
-            </w:r>
-            <w:proofErr w:type="spellEnd"/>
+            <w:r>
+              <w:t>Скопова Трубка Фонендовна</w:t>
+            </w:r>
           </w:p>
         </w:tc>
         <w:tc>
@@ -14260,6 +13672,7 @@
   <w:style w:type="character" w:default="1" w:styleId="a0">
     <w:name w:val="Default Paragraph Font"/>
     <w:uiPriority w:val="1"/>
+    <w:semiHidden/>
     <w:unhideWhenUsed/>
   </w:style>
   <w:style w:type="table" w:default="1" w:styleId="a1">

</xml_diff>

<commit_message>
Add Docker Compose deployment and document container workflow.
Two services (api + bot) share Chroma/SQLite volume; DOCKER.md and project docs updated; remove duplicate cost file.

Co-authored-by: Cursor <cursoragent@cursor.com>
</commit_message>
<xml_diff>
--- a/Техническое задание.docx
+++ b/Техническое задание.docx
@@ -5203,6 +5203,7 @@
                 <w:i/>
                 <w:iCs/>
                 <w:color w:val="0D0D0D" w:themeColor="text1" w:themeTint="F2"/>
+                <w:lang w:val="en-US"/>
               </w:rPr>
               <w:t>5.</w:t>
             </w:r>
@@ -6027,6 +6028,78 @@
                 <w:color w:val="0D0D0D" w:themeColor="text1" w:themeTint="F2"/>
               </w:rPr>
               <w:t>CRM, медицинская информационная система, Google Sheets, календарь записи</w:t>
+            </w:r>
+          </w:p>
+        </w:tc>
+      </w:tr>
+      <w:tr>
+        <w:tc>
+          <w:tcPr>
+            <w:tcW w:w="4513" w:type="dxa"/>
+            <w:tcBorders>
+              <w:top w:val="nil"/>
+              <w:left w:val="nil"/>
+              <w:bottom w:val="nil"/>
+              <w:right w:val="nil"/>
+            </w:tcBorders>
+            <w:tcMar>
+              <w:top w:w="100" w:type="dxa"/>
+              <w:left w:w="120" w:type="dxa"/>
+              <w:bottom w:w="100" w:type="dxa"/>
+              <w:right w:w="120" w:type="dxa"/>
+            </w:tcMar>
+          </w:tcPr>
+          <w:p>
+            <w:pPr>
+              <w:rPr>
+                <w:b/>
+                <w:bCs/>
+                <w:color w:val="0D0D0D" w:themeColor="text1" w:themeTint="F2"/>
+              </w:rPr>
+            </w:pPr>
+            <w:r>
+              <w:rPr>
+                <w:b/>
+                <w:bCs/>
+                <w:color w:val="0D0D0D" w:themeColor="text1" w:themeTint="F2"/>
+              </w:rPr>
+              <w:t>Развёртывание:</w:t>
+            </w:r>
+          </w:p>
+        </w:tc>
+        <w:tc>
+          <w:tcPr>
+            <w:tcW w:w="4513" w:type="dxa"/>
+            <w:tcBorders>
+              <w:top w:val="single" w:sz="4" w:space="0" w:color="CCCCCC"/>
+              <w:left w:val="single" w:sz="4" w:space="0" w:color="CCCCCC"/>
+              <w:bottom w:val="single" w:sz="4" w:space="0" w:color="CCCCCC"/>
+              <w:right w:val="single" w:sz="4" w:space="0" w:color="CCCCCC"/>
+            </w:tcBorders>
+            <w:shd w:val="clear" w:color="auto" w:fill="F5F5F5"/>
+            <w:tcMar>
+              <w:top w:w="100" w:type="dxa"/>
+              <w:left w:w="120" w:type="dxa"/>
+              <w:bottom w:w="100" w:type="dxa"/>
+              <w:right w:w="120" w:type="dxa"/>
+            </w:tcMar>
+          </w:tcPr>
+          <w:p>
+            <w:pPr>
+              <w:rPr>
+                <w:i/>
+                <w:iCs/>
+                <w:color w:val="0D0D0D" w:themeColor="text1" w:themeTint="F2"/>
+              </w:rPr>
+            </w:pPr>
+            <w:r>
+              <w:rPr>
+                <w:i/>
+                <w:iCs/>
+                <w:color w:val="0D0D0D" w:themeColor="text1" w:themeTint="F2"/>
+                <w:lang w:val="en-US"/>
+              </w:rPr>
+              <w:t>Docker</w:t>
             </w:r>
           </w:p>
         </w:tc>
@@ -6522,6 +6595,7 @@
                 <w:iCs/>
                 <w:color w:val="0D0D0D" w:themeColor="text1" w:themeTint="F2"/>
               </w:rPr>
+              <w:lastRenderedPageBreak/>
               <w:t>Бюджет:</w:t>
             </w:r>
             <w:r>
@@ -6539,16 +6613,7 @@
                 <w:color w:val="0D0D0D" w:themeColor="text1" w:themeTint="F2"/>
               </w:rPr>
               <w:br/>
-              <w:t xml:space="preserve">Для дипломного проекта бюджет может быть ограничен бесплатными или </w:t>
-            </w:r>
-            <w:r>
-              <w:rPr>
-                <w:i/>
-                <w:iCs/>
-                <w:color w:val="0D0D0D" w:themeColor="text1" w:themeTint="F2"/>
-              </w:rPr>
-              <w:lastRenderedPageBreak/>
-              <w:t>недорогими инструментами. Например, можно использовать локальную векторную базу FAISS или Chroma.</w:t>
+              <w:t>Для дипломного проекта бюджет может быть ограничен бесплатными или недорогими инструментами. Например, можно использовать локальную векторную базу FAISS или Chroma.</w:t>
             </w:r>
           </w:p>
           <w:p>
@@ -7793,6 +7858,7 @@
               <w:rPr>
                 <w:color w:val="0D0D0D" w:themeColor="text1" w:themeTint="F2"/>
               </w:rPr>
+              <w:lastRenderedPageBreak/>
               <w:t>Некорректная маршрутизация обращения</w:t>
             </w:r>
           </w:p>
@@ -9006,6 +9072,7 @@
           <w:sz w:val="24"/>
           <w:szCs w:val="24"/>
         </w:rPr>
+        <w:lastRenderedPageBreak/>
         <w:t>☑</w:t>
       </w:r>
       <w:r>
@@ -9062,7 +9129,6 @@
           <w:sz w:val="24"/>
           <w:szCs w:val="24"/>
         </w:rPr>
-        <w:lastRenderedPageBreak/>
         <w:t>☑</w:t>
       </w:r>
       <w:r>

</xml_diff>